<commit_message>
docs: update playbook with live branch/PR/CI build status
</commit_message>
<xml_diff>
--- a/TicketHub_Project_Playbook.docx
+++ b/TicketHub_Project_Playbook.docx
@@ -4787,650 +4787,542 @@
       <w:pPr>
         <w:pStyle w:val="Heading2"/>
       </w:pPr>
-      <w:bookmarkStart w:id="48" w:name="cheat-sheet"/>
-      <w:r>
-        <w:t xml:space="preserve">14. Cheat sheet</w:t>
+      <w:bookmarkStart w:id="48" w:name="live-build-status-branches-jira-pr-ci"/>
+      <w:r>
+        <w:t xml:space="preserve">14. Live build status (branches → Jira → PR → CI)</w:t>
       </w:r>
       <w:bookmarkEnd w:id="48"/>
     </w:p>
     <w:p>
       <w:pPr>
-        <w:pStyle w:val="SourceCode"/>
-      </w:pPr>
-      <w:r>
-        <w:rPr>
-          <w:rStyle w:val="CommentTok"/>
-        </w:rPr>
-        <w:t xml:space="preserve"># run locally</w:t>
-      </w:r>
-      <w:r>
-        <w:br/>
-      </w:r>
-      <w:r>
-        <w:rPr>
-          <w:rStyle w:val="BuiltInTok"/>
-        </w:rPr>
-        <w:t xml:space="preserve">cd</w:t>
-      </w:r>
-      <w:r>
-        <w:rPr>
-          <w:rStyle w:val="NormalTok"/>
-        </w:rPr>
-        <w:t xml:space="preserve"> backend </w:t>
-      </w:r>
-      <w:r>
-        <w:rPr>
-          <w:rStyle w:val="KeywordTok"/>
-        </w:rPr>
-        <w:t xml:space="preserve">&amp;&amp;</w:t>
-      </w:r>
-      <w:r>
-        <w:rPr>
-          <w:rStyle w:val="NormalTok"/>
-        </w:rPr>
-        <w:t xml:space="preserve"> </w:t>
-      </w:r>
-      <w:r>
-        <w:rPr>
-          <w:rStyle w:val="ExtensionTok"/>
-        </w:rPr>
-        <w:t xml:space="preserve">npm</w:t>
-      </w:r>
-      <w:r>
-        <w:rPr>
-          <w:rStyle w:val="NormalTok"/>
-        </w:rPr>
-        <w:t xml:space="preserve"> run dev</w:t>
-      </w:r>
-      <w:r>
-        <w:br/>
-      </w:r>
-      <w:r>
-        <w:rPr>
-          <w:rStyle w:val="BuiltInTok"/>
-        </w:rPr>
-        <w:t xml:space="preserve">cd</w:t>
-      </w:r>
-      <w:r>
-        <w:rPr>
-          <w:rStyle w:val="NormalTok"/>
-        </w:rPr>
-        <w:t xml:space="preserve"> frontend </w:t>
-      </w:r>
-      <w:r>
-        <w:rPr>
-          <w:rStyle w:val="KeywordTok"/>
-        </w:rPr>
-        <w:t xml:space="preserve">&amp;&amp;</w:t>
-      </w:r>
-      <w:r>
-        <w:rPr>
-          <w:rStyle w:val="NormalTok"/>
-        </w:rPr>
-        <w:t xml:space="preserve"> </w:t>
-      </w:r>
-      <w:r>
-        <w:rPr>
-          <w:rStyle w:val="ExtensionTok"/>
-        </w:rPr>
-        <w:t xml:space="preserve">npm</w:t>
-      </w:r>
-      <w:r>
-        <w:rPr>
-          <w:rStyle w:val="NormalTok"/>
-        </w:rPr>
-        <w:t xml:space="preserve"> run dev</w:t>
-      </w:r>
-      <w:r>
-        <w:br/>
-      </w:r>
-      <w:r>
-        <w:rPr>
-          <w:rStyle w:val="ExtensionTok"/>
-        </w:rPr>
-        <w:t xml:space="preserve">npm</w:t>
-      </w:r>
-      <w:r>
-        <w:rPr>
-          <w:rStyle w:val="NormalTok"/>
-        </w:rPr>
-        <w:t xml:space="preserve"> run seed                      # reseed DB</w:t>
-      </w:r>
-      <w:r>
-        <w:br/>
-      </w:r>
-      <w:r>
-        <w:br/>
-      </w:r>
-      <w:r>
-        <w:rPr>
-          <w:rStyle w:val="CommentTok"/>
-        </w:rPr>
-        <w:t xml:space="preserve"># tests</w:t>
-      </w:r>
-      <w:r>
-        <w:br/>
-      </w:r>
-      <w:r>
-        <w:rPr>
-          <w:rStyle w:val="BuiltInTok"/>
-        </w:rPr>
-        <w:t xml:space="preserve">cd</w:t>
-      </w:r>
-      <w:r>
-        <w:rPr>
-          <w:rStyle w:val="NormalTok"/>
-        </w:rPr>
-        <w:t xml:space="preserve"> backend </w:t>
-      </w:r>
-      <w:r>
-        <w:rPr>
-          <w:rStyle w:val="KeywordTok"/>
-        </w:rPr>
-        <w:t xml:space="preserve">&amp;&amp;</w:t>
-      </w:r>
-      <w:r>
-        <w:rPr>
-          <w:rStyle w:val="NormalTok"/>
-        </w:rPr>
-        <w:t xml:space="preserve"> </w:t>
-      </w:r>
-      <w:r>
-        <w:rPr>
-          <w:rStyle w:val="ExtensionTok"/>
-        </w:rPr>
-        <w:t xml:space="preserve">npm</w:t>
-      </w:r>
-      <w:r>
-        <w:rPr>
-          <w:rStyle w:val="NormalTok"/>
-        </w:rPr>
-        <w:t xml:space="preserve"> test</w:t>
-      </w:r>
-      <w:r>
-        <w:br/>
-      </w:r>
-      <w:r>
-        <w:rPr>
-          <w:rStyle w:val="ExtensionTok"/>
-        </w:rPr>
-        <w:t xml:space="preserve">npx</w:t>
-      </w:r>
-      <w:r>
-        <w:rPr>
-          <w:rStyle w:val="NormalTok"/>
-        </w:rPr>
-        <w:t xml:space="preserve"> mocha --grep </w:t>
-      </w:r>
-      <w:r>
-        <w:rPr>
-          <w:rStyle w:val="StringTok"/>
-        </w:rPr>
-        <w:t xml:space="preserve">"Strategy"</w:t>
-      </w:r>
-      <w:r>
-        <w:br/>
-      </w:r>
-      <w:r>
-        <w:br/>
-      </w:r>
-      <w:r>
-        <w:rPr>
-          <w:rStyle w:val="CommentTok"/>
-        </w:rPr>
-        <w:t xml:space="preserve"># git: new task branch</w:t>
-      </w:r>
-      <w:r>
-        <w:br/>
-      </w:r>
-      <w:r>
-        <w:rPr>
-          <w:rStyle w:val="FunctionTok"/>
-        </w:rPr>
-        <w:t xml:space="preserve">git</w:t>
-      </w:r>
-      <w:r>
-        <w:rPr>
-          <w:rStyle w:val="NormalTok"/>
-        </w:rPr>
-        <w:t xml:space="preserve"> checkout main </w:t>
-      </w:r>
-      <w:r>
-        <w:rPr>
-          <w:rStyle w:val="KeywordTok"/>
-        </w:rPr>
-        <w:t xml:space="preserve">&amp;&amp;</w:t>
-      </w:r>
-      <w:r>
-        <w:rPr>
-          <w:rStyle w:val="NormalTok"/>
-        </w:rPr>
-        <w:t xml:space="preserve"> </w:t>
-      </w:r>
-      <w:r>
-        <w:rPr>
-          <w:rStyle w:val="FunctionTok"/>
-        </w:rPr>
-        <w:t xml:space="preserve">git</w:t>
-      </w:r>
-      <w:r>
-        <w:rPr>
-          <w:rStyle w:val="NormalTok"/>
-        </w:rPr>
-        <w:t xml:space="preserve"> checkout -b feature/</w:t>
-      </w:r>
-      <w:r>
-        <w:rPr>
-          <w:rStyle w:val="OperatorTok"/>
-        </w:rPr>
-        <w:t xml:space="preserve">&lt;</w:t>
-      </w:r>
-      <w:r>
-        <w:rPr>
-          <w:rStyle w:val="NormalTok"/>
-        </w:rPr>
-        <w:t xml:space="preserve">name</w:t>
-      </w:r>
-      <w:r>
-        <w:rPr>
-          <w:rStyle w:val="OperatorTok"/>
-        </w:rPr>
-        <w:t xml:space="preserve">&gt;</w:t>
-      </w:r>
-      <w:r>
-        <w:br/>
-      </w:r>
-      <w:r>
-        <w:rPr>
-          <w:rStyle w:val="FunctionTok"/>
-        </w:rPr>
-        <w:t xml:space="preserve">git</w:t>
-      </w:r>
-      <w:r>
-        <w:rPr>
-          <w:rStyle w:val="NormalTok"/>
-        </w:rPr>
-        <w:t xml:space="preserve"> add </w:t>
-      </w:r>
-      <w:r>
-        <w:rPr>
-          <w:rStyle w:val="OperatorTok"/>
-        </w:rPr>
-        <w:t xml:space="preserve">&lt;</w:t>
-      </w:r>
-      <w:r>
-        <w:rPr>
-          <w:rStyle w:val="NormalTok"/>
-        </w:rPr>
-        <w:t xml:space="preserve">files</w:t>
-      </w:r>
-      <w:r>
-        <w:rPr>
-          <w:rStyle w:val="OperatorTok"/>
-        </w:rPr>
-        <w:t xml:space="preserve">&gt;</w:t>
-      </w:r>
-      <w:r>
-        <w:rPr>
-          <w:rStyle w:val="NormalTok"/>
-        </w:rPr>
-        <w:t xml:space="preserve"> </w:t>
-      </w:r>
-      <w:r>
-        <w:rPr>
-          <w:rStyle w:val="KeywordTok"/>
-        </w:rPr>
-        <w:t xml:space="preserve">&amp;&amp;</w:t>
-      </w:r>
-      <w:r>
-        <w:rPr>
-          <w:rStyle w:val="NormalTok"/>
-        </w:rPr>
-        <w:t xml:space="preserve"> </w:t>
-      </w:r>
-      <w:r>
-        <w:rPr>
-          <w:rStyle w:val="FunctionTok"/>
-        </w:rPr>
-        <w:t xml:space="preserve">git</w:t>
-      </w:r>
-      <w:r>
-        <w:rPr>
-          <w:rStyle w:val="NormalTok"/>
-        </w:rPr>
-        <w:t xml:space="preserve"> commit -m </w:t>
-      </w:r>
-      <w:r>
-        <w:rPr>
-          <w:rStyle w:val="StringTok"/>
-        </w:rPr>
-        <w:t xml:space="preserve">"feat: ..."</w:t>
-      </w:r>
-      <w:r>
-        <w:br/>
-      </w:r>
-      <w:r>
-        <w:rPr>
-          <w:rStyle w:val="FunctionTok"/>
-        </w:rPr>
-        <w:t xml:space="preserve">git</w:t>
-      </w:r>
-      <w:r>
-        <w:rPr>
-          <w:rStyle w:val="NormalTok"/>
-        </w:rPr>
-        <w:t xml:space="preserve"> push -u origin feature/</w:t>
-      </w:r>
-      <w:r>
-        <w:rPr>
-          <w:rStyle w:val="OperatorTok"/>
-        </w:rPr>
-        <w:t xml:space="preserve">&lt;</w:t>
-      </w:r>
-      <w:r>
-        <w:rPr>
-          <w:rStyle w:val="NormalTok"/>
-        </w:rPr>
-        <w:t xml:space="preserve">name</w:t>
-      </w:r>
-      <w:r>
-        <w:rPr>
-          <w:rStyle w:val="OperatorTok"/>
-        </w:rPr>
-        <w:t xml:space="preserve">&gt;</w:t>
-      </w:r>
-      <w:r>
-        <w:br/>
-      </w:r>
-      <w:r>
-        <w:br/>
-      </w:r>
-      <w:r>
-        <w:rPr>
-          <w:rStyle w:val="CommentTok"/>
-        </w:rPr>
-        <w:t xml:space="preserve"># PR + merge (gh CLI)</w:t>
-      </w:r>
-      <w:r>
-        <w:br/>
-      </w:r>
-      <w:r>
-        <w:rPr>
-          <w:rStyle w:val="ExtensionTok"/>
-        </w:rPr>
-        <w:t xml:space="preserve">gh</w:t>
-      </w:r>
-      <w:r>
-        <w:rPr>
-          <w:rStyle w:val="NormalTok"/>
-        </w:rPr>
-        <w:t xml:space="preserve"> pr create --base main --head feature/</w:t>
-      </w:r>
-      <w:r>
-        <w:rPr>
-          <w:rStyle w:val="OperatorTok"/>
-        </w:rPr>
-        <w:t xml:space="preserve">&lt;</w:t>
-      </w:r>
-      <w:r>
-        <w:rPr>
-          <w:rStyle w:val="NormalTok"/>
-        </w:rPr>
-        <w:t xml:space="preserve">name</w:t>
-      </w:r>
-      <w:r>
-        <w:rPr>
-          <w:rStyle w:val="OperatorTok"/>
-        </w:rPr>
-        <w:t xml:space="preserve">&gt;</w:t>
-      </w:r>
-      <w:r>
-        <w:rPr>
-          <w:rStyle w:val="NormalTok"/>
-        </w:rPr>
-        <w:t xml:space="preserve"> --fill</w:t>
-      </w:r>
-      <w:r>
-        <w:br/>
-      </w:r>
-      <w:r>
-        <w:rPr>
-          <w:rStyle w:val="ExtensionTok"/>
-        </w:rPr>
-        <w:t xml:space="preserve">gh</w:t>
-      </w:r>
-      <w:r>
-        <w:rPr>
-          <w:rStyle w:val="NormalTok"/>
-        </w:rPr>
-        <w:t xml:space="preserve"> pr merge feature/</w:t>
-      </w:r>
-      <w:r>
-        <w:rPr>
-          <w:rStyle w:val="OperatorTok"/>
-        </w:rPr>
-        <w:t xml:space="preserve">&lt;</w:t>
-      </w:r>
-      <w:r>
-        <w:rPr>
-          <w:rStyle w:val="NormalTok"/>
-        </w:rPr>
-        <w:t xml:space="preserve">name</w:t>
-      </w:r>
-      <w:r>
-        <w:rPr>
-          <w:rStyle w:val="OperatorTok"/>
-        </w:rPr>
-        <w:t xml:space="preserve">&gt;</w:t>
-      </w:r>
-      <w:r>
-        <w:rPr>
-          <w:rStyle w:val="NormalTok"/>
-        </w:rPr>
-        <w:t xml:space="preserve"> --merge --delete-branch</w:t>
-      </w:r>
-      <w:r>
-        <w:br/>
-      </w:r>
-      <w:r>
-        <w:br/>
-      </w:r>
-      <w:r>
-        <w:rPr>
-          <w:rStyle w:val="CommentTok"/>
-        </w:rPr>
-        <w:t xml:space="preserve"># promote to production (deploys)</w:t>
-      </w:r>
-      <w:r>
-        <w:br/>
-      </w:r>
-      <w:r>
-        <w:rPr>
-          <w:rStyle w:val="ExtensionTok"/>
-        </w:rPr>
-        <w:t xml:space="preserve">gh</w:t>
-      </w:r>
-      <w:r>
-        <w:rPr>
-          <w:rStyle w:val="NormalTok"/>
-        </w:rPr>
-        <w:t xml:space="preserve"> pr create --base production --head main --fill</w:t>
-      </w:r>
-      <w:r>
-        <w:br/>
-      </w:r>
-      <w:r>
-        <w:rPr>
-          <w:rStyle w:val="ExtensionTok"/>
-        </w:rPr>
-        <w:t xml:space="preserve">gh</w:t>
-      </w:r>
-      <w:r>
-        <w:rPr>
-          <w:rStyle w:val="NormalTok"/>
-        </w:rPr>
-        <w:t xml:space="preserve"> pr merge --merge</w:t>
-      </w:r>
-      <w:r>
-        <w:br/>
-      </w:r>
-      <w:r>
-        <w:br/>
-      </w:r>
-      <w:r>
-        <w:rPr>
-          <w:rStyle w:val="CommentTok"/>
-        </w:rPr>
-        <w:t xml:space="preserve"># AWS via Terraform (local)</w:t>
-      </w:r>
-      <w:r>
-        <w:br/>
-      </w:r>
-      <w:r>
-        <w:rPr>
-          <w:rStyle w:val="BuiltInTok"/>
-        </w:rPr>
-        <w:t xml:space="preserve">cd</w:t>
-      </w:r>
-      <w:r>
-        <w:rPr>
-          <w:rStyle w:val="NormalTok"/>
-        </w:rPr>
-        <w:t xml:space="preserve"> terraform </w:t>
-      </w:r>
-      <w:r>
-        <w:rPr>
-          <w:rStyle w:val="KeywordTok"/>
-        </w:rPr>
-        <w:t xml:space="preserve">&amp;&amp;</w:t>
-      </w:r>
-      <w:r>
-        <w:rPr>
-          <w:rStyle w:val="NormalTok"/>
-        </w:rPr>
-        <w:t xml:space="preserve"> </w:t>
-      </w:r>
-      <w:r>
-        <w:rPr>
-          <w:rStyle w:val="ExtensionTok"/>
-        </w:rPr>
-        <w:t xml:space="preserve">terraform</w:t>
-      </w:r>
-      <w:r>
-        <w:rPr>
-          <w:rStyle w:val="NormalTok"/>
-        </w:rPr>
-        <w:t xml:space="preserve"> init </w:t>
-      </w:r>
-      <w:r>
-        <w:rPr>
-          <w:rStyle w:val="KeywordTok"/>
-        </w:rPr>
-        <w:t xml:space="preserve">&amp;&amp;</w:t>
-      </w:r>
-      <w:r>
-        <w:rPr>
-          <w:rStyle w:val="NormalTok"/>
-        </w:rPr>
-        <w:t xml:space="preserve"> </w:t>
-      </w:r>
-      <w:r>
-        <w:rPr>
-          <w:rStyle w:val="ExtensionTok"/>
-        </w:rPr>
-        <w:t xml:space="preserve">terraform</w:t>
-      </w:r>
-      <w:r>
-        <w:rPr>
-          <w:rStyle w:val="NormalTok"/>
-        </w:rPr>
-        <w:t xml:space="preserve"> plan </w:t>
-      </w:r>
-      <w:r>
-        <w:rPr>
-          <w:rStyle w:val="KeywordTok"/>
-        </w:rPr>
-        <w:t xml:space="preserve">&amp;&amp;</w:t>
-      </w:r>
-      <w:r>
-        <w:rPr>
-          <w:rStyle w:val="NormalTok"/>
-        </w:rPr>
-        <w:t xml:space="preserve"> </w:t>
-      </w:r>
-      <w:r>
-        <w:rPr>
-          <w:rStyle w:val="ExtensionTok"/>
-        </w:rPr>
-        <w:t xml:space="preserve">terraform</w:t>
-      </w:r>
-      <w:r>
-        <w:rPr>
-          <w:rStyle w:val="NormalTok"/>
-        </w:rPr>
-        <w:t xml:space="preserve"> apply</w:t>
-      </w:r>
-      <w:r>
-        <w:br/>
-      </w:r>
-      <w:r>
-        <w:rPr>
-          <w:rStyle w:val="ExtensionTok"/>
-        </w:rPr>
-        <w:t xml:space="preserve">terraform</w:t>
-      </w:r>
-      <w:r>
-        <w:rPr>
-          <w:rStyle w:val="NormalTok"/>
-        </w:rPr>
-        <w:t xml:space="preserve"> output summary</w:t>
-      </w:r>
-      <w:r>
-        <w:br/>
-      </w:r>
-      <w:r>
-        <w:rPr>
-          <w:rStyle w:val="ExtensionTok"/>
-        </w:rPr>
-        <w:t xml:space="preserve">terraform</w:t>
-      </w:r>
-      <w:r>
-        <w:rPr>
-          <w:rStyle w:val="NormalTok"/>
-        </w:rPr>
-        <w:t xml:space="preserve"> destroy                 # when done</w:t>
-      </w:r>
-    </w:p>
-    <w:p>
-      <w:r>
-        <w:pict>
-          <v:rect style="width:0;height:1.5pt" o:hralign="center" o:hrstd="t" o:hr="t"/>
-        </w:pict>
-      </w:r>
-    </w:p>
-    <w:p>
-      <w:pPr>
         <w:pStyle w:val="FirstParagraph"/>
       </w:pPr>
       <w:r>
-        <w:rPr>
-          <w:i/>
-        </w:rPr>
-        <w:t xml:space="preserve">Generated as a personal runbook. Keep this file in the repo root so the whole team can</w:t>
-      </w:r>
-      <w:r>
-        <w:rPr>
-          <w:i/>
-        </w:rPr>
-        <w:t xml:space="preserve"> </w:t>
-      </w:r>
-      <w:r>
-        <w:rPr>
-          <w:i/>
-        </w:rPr>
-        <w:t xml:space="preserve">follow the same steps.</w:t>
-      </w:r>
-    </w:p>
+        <w:t xml:space="preserve">Each Jira task has its own branch with its own commit/file. Open a PR per branch into</w:t>
+      </w:r>
+      <w:r>
+        <w:t xml:space="preserve"> </w:t>
+      </w:r>
+      <w:r>
+        <w:rPr>
+          <w:rStyle w:val="VerbatimChar"/>
+        </w:rPr>
+        <w:t xml:space="preserve">main</w:t>
+      </w:r>
+      <w:r>
+        <w:t xml:space="preserve">;</w:t>
+      </w:r>
+      <w:r>
+        <w:t xml:space="preserve"> </w:t>
+      </w:r>
+      <w:r>
+        <w:rPr>
+          <w:rStyle w:val="VerbatimChar"/>
+        </w:rPr>
+        <w:t xml:space="preserve">ci.yml</w:t>
+      </w:r>
+      <w:r>
+        <w:t xml:space="preserve"> </w:t>
+      </w:r>
+      <w:r>
+        <w:t xml:space="preserve">runs on the PR (tests + build); review and merge; then promote</w:t>
+      </w:r>
+      <w:r>
+        <w:t xml:space="preserve"> </w:t>
+      </w:r>
+      <w:r>
+        <w:rPr>
+          <w:rStyle w:val="VerbatimChar"/>
+        </w:rPr>
+        <w:t xml:space="preserve">main</w:t>
+      </w:r>
+      <w:r>
+        <w:t xml:space="preserve"> </w:t>
+      </w:r>
+      <w:r>
+        <w:t xml:space="preserve">→</w:t>
+      </w:r>
+      <w:r>
+        <w:t xml:space="preserve"> </w:t>
+      </w:r>
+      <w:r>
+        <w:rPr>
+          <w:rStyle w:val="VerbatimChar"/>
+        </w:rPr>
+        <w:t xml:space="preserve">production</w:t>
+      </w:r>
+      <w:r>
+        <w:t xml:space="preserve">.</w:t>
+      </w:r>
+    </w:p>
+    <w:p>
+      <w:pPr>
+        <w:pStyle w:val="Heading3"/>
+      </w:pPr>
+      <w:bookmarkStart w:id="49" w:name="X24c969ff077ea3d3aa3b8da0da3acb8f7bc9f17"/>
+      <w:r>
+        <w:t xml:space="preserve">event-ticket_2 (assignment_2) — branches carry the real files</w:t>
+      </w:r>
+      <w:bookmarkEnd w:id="49"/>
+    </w:p>
+    <w:tbl>
+      <w:tblPr>
+        <w:tblStyle w:val="Table"/>
+        <w:tblW w:type="pct" w:w="5000.0"/>
+        <w:tblLook w:firstRow="1"/>
+      </w:tblPr>
+      <w:tblGrid>
+        <w:gridCol w:w="1980"/>
+        <w:gridCol w:w="1980"/>
+        <w:gridCol w:w="1980"/>
+        <w:gridCol w:w="1980"/>
+      </w:tblGrid>
+      <w:tr>
+        <w:trPr>
+          <w:cnfStyle w:firstRow="1"/>
+        </w:trPr>
+        <w:tc>
+          <w:tcPr>
+            <w:tcBorders>
+              <w:bottom w:val="single"/>
+            </w:tcBorders>
+            <w:vAlign w:val="bottom"/>
+          </w:tcPr>
+          <w:p>
+            <w:pPr>
+              <w:pStyle w:val="Compact"/>
+              <w:jc w:val="left"/>
+            </w:pPr>
+            <w:r>
+              <w:t xml:space="preserve">Branch</w:t>
+            </w:r>
+          </w:p>
+        </w:tc>
+        <w:tc>
+          <w:tcPr>
+            <w:tcBorders>
+              <w:bottom w:val="single"/>
+            </w:tcBorders>
+            <w:vAlign w:val="bottom"/>
+          </w:tcPr>
+          <w:p>
+            <w:pPr>
+              <w:pStyle w:val="Compact"/>
+              <w:jc w:val="left"/>
+            </w:pPr>
+            <w:r>
+              <w:t xml:space="preserve">Jira</w:t>
+            </w:r>
+          </w:p>
+        </w:tc>
+        <w:tc>
+          <w:tcPr>
+            <w:tcBorders>
+              <w:bottom w:val="single"/>
+            </w:tcBorders>
+            <w:vAlign w:val="bottom"/>
+          </w:tcPr>
+          <w:p>
+            <w:pPr>
+              <w:pStyle w:val="Compact"/>
+              <w:jc w:val="left"/>
+            </w:pPr>
+            <w:r>
+              <w:t xml:space="preserve">Commit</w:t>
+            </w:r>
+          </w:p>
+        </w:tc>
+        <w:tc>
+          <w:tcPr>
+            <w:tcBorders>
+              <w:bottom w:val="single"/>
+            </w:tcBorders>
+            <w:vAlign w:val="bottom"/>
+          </w:tcPr>
+          <w:p>
+            <w:pPr>
+              <w:pStyle w:val="Compact"/>
+              <w:jc w:val="left"/>
+            </w:pPr>
+            <w:r>
+              <w:t xml:space="preserve">Contents</w:t>
+            </w:r>
+          </w:p>
+        </w:tc>
+      </w:tr>
+      <w:tr>
+        <w:tc>
+          <w:p>
+            <w:pPr>
+              <w:pStyle w:val="Compact"/>
+              <w:jc w:val="left"/>
+            </w:pPr>
+            <w:r>
+              <w:rPr>
+                <w:rStyle w:val="VerbatimChar"/>
+              </w:rPr>
+              <w:t xml:space="preserve">feature/oop-principles</w:t>
+            </w:r>
+          </w:p>
+        </w:tc>
+        <w:tc>
+          <w:p>
+            <w:pPr>
+              <w:pStyle w:val="Compact"/>
+              <w:jc w:val="left"/>
+            </w:pPr>
+            <w:r>
+              <w:t xml:space="preserve">SCRUM-262</w:t>
+            </w:r>
+          </w:p>
+        </w:tc>
+        <w:tc>
+          <w:p>
+            <w:pPr>
+              <w:pStyle w:val="Compact"/>
+              <w:jc w:val="left"/>
+            </w:pPr>
+            <w:r>
+              <w:t xml:space="preserve">1022dc0</w:t>
+            </w:r>
+          </w:p>
+        </w:tc>
+        <w:tc>
+          <w:p>
+            <w:pPr>
+              <w:pStyle w:val="Compact"/>
+              <w:jc w:val="left"/>
+            </w:pPr>
+            <w:r>
+              <w:rPr>
+                <w:rStyle w:val="VerbatimChar"/>
+              </w:rPr>
+              <w:t xml:space="preserve">backend/domain/*</w:t>
+            </w:r>
+            <w:r>
+              <w:t xml:space="preserve"> </w:t>
+            </w:r>
+            <w:r>
+              <w:t xml:space="preserve">+</w:t>
+            </w:r>
+            <w:r>
+              <w:t xml:space="preserve"> </w:t>
+            </w:r>
+            <w:r>
+              <w:rPr>
+                <w:rStyle w:val="VerbatimChar"/>
+              </w:rPr>
+              <w:t xml:space="preserve">authController.js</w:t>
+            </w:r>
+          </w:p>
+        </w:tc>
+      </w:tr>
+      <w:tr>
+        <w:tc>
+          <w:p>
+            <w:pPr>
+              <w:pStyle w:val="Compact"/>
+              <w:jc w:val="left"/>
+            </w:pPr>
+            <w:r>
+              <w:rPr>
+                <w:rStyle w:val="VerbatimChar"/>
+              </w:rPr>
+              <w:t xml:space="preserve">feature/design-patterns</w:t>
+            </w:r>
+          </w:p>
+        </w:tc>
+        <w:tc>
+          <w:p>
+            <w:pPr>
+              <w:pStyle w:val="Compact"/>
+              <w:jc w:val="left"/>
+            </w:pPr>
+            <w:r>
+              <w:t xml:space="preserve">SCRUM-263</w:t>
+            </w:r>
+          </w:p>
+        </w:tc>
+        <w:tc>
+          <w:p>
+            <w:pPr>
+              <w:pStyle w:val="Compact"/>
+              <w:jc w:val="left"/>
+            </w:pPr>
+            <w:r>
+              <w:t xml:space="preserve">31ba951</w:t>
+            </w:r>
+          </w:p>
+        </w:tc>
+        <w:tc>
+          <w:p>
+            <w:pPr>
+              <w:pStyle w:val="Compact"/>
+              <w:jc w:val="left"/>
+            </w:pPr>
+            <w:r>
+              <w:rPr>
+                <w:rStyle w:val="VerbatimChar"/>
+              </w:rPr>
+              <w:t xml:space="preserve">backend/patterns/*</w:t>
+            </w:r>
+            <w:r>
+              <w:t xml:space="preserve"> </w:t>
+            </w:r>
+            <w:r>
+              <w:t xml:space="preserve">+</w:t>
+            </w:r>
+            <w:r>
+              <w:t xml:space="preserve"> </w:t>
+            </w:r>
+            <w:r>
+              <w:rPr>
+                <w:rStyle w:val="VerbatimChar"/>
+              </w:rPr>
+              <w:t xml:space="preserve">services/bookingService.js</w:t>
+            </w:r>
+            <w:r>
+              <w:t xml:space="preserve"> </w:t>
+            </w:r>
+            <w:r>
+              <w:t xml:space="preserve">+ controllers +</w:t>
+            </w:r>
+            <w:r>
+              <w:t xml:space="preserve"> </w:t>
+            </w:r>
+            <w:r>
+              <w:rPr>
+                <w:rStyle w:val="VerbatimChar"/>
+              </w:rPr>
+              <w:t xml:space="preserve">eventRoutes.js</w:t>
+            </w:r>
+          </w:p>
+        </w:tc>
+      </w:tr>
+      <w:tr>
+        <w:tc>
+          <w:p>
+            <w:pPr>
+              <w:pStyle w:val="Compact"/>
+              <w:jc w:val="left"/>
+            </w:pPr>
+            <w:r>
+              <w:rPr>
+                <w:rStyle w:val="VerbatimChar"/>
+              </w:rPr>
+              <w:t xml:space="preserve">feature/unit-testing</w:t>
+            </w:r>
+          </w:p>
+        </w:tc>
+        <w:tc>
+          <w:p>
+            <w:pPr>
+              <w:pStyle w:val="Compact"/>
+              <w:jc w:val="left"/>
+            </w:pPr>
+            <w:r>
+              <w:t xml:space="preserve">SCRUM-264</w:t>
+            </w:r>
+          </w:p>
+        </w:tc>
+        <w:tc>
+          <w:p>
+            <w:pPr>
+              <w:pStyle w:val="Compact"/>
+              <w:jc w:val="left"/>
+            </w:pPr>
+            <w:r>
+              <w:t xml:space="preserve">27e0ccf</w:t>
+            </w:r>
+          </w:p>
+        </w:tc>
+        <w:tc>
+          <w:p>
+            <w:pPr>
+              <w:pStyle w:val="Compact"/>
+              <w:jc w:val="left"/>
+            </w:pPr>
+            <w:r>
+              <w:rPr>
+                <w:rStyle w:val="VerbatimChar"/>
+              </w:rPr>
+              <w:t xml:space="preserve">backend/test/*</w:t>
+            </w:r>
+            <w:r>
+              <w:t xml:space="preserve"> </w:t>
+            </w:r>
+            <w:r>
+              <w:t xml:space="preserve">+</w:t>
+            </w:r>
+            <w:r>
+              <w:t xml:space="preserve"> </w:t>
+            </w:r>
+            <w:r>
+              <w:rPr>
+                <w:rStyle w:val="VerbatimChar"/>
+              </w:rPr>
+              <w:t xml:space="preserve">package.json</w:t>
+            </w:r>
+            <w:r>
+              <w:t xml:space="preserve"> </w:t>
+            </w:r>
+            <w:r>
+              <w:t xml:space="preserve">/</w:t>
+            </w:r>
+            <w:r>
+              <w:t xml:space="preserve"> </w:t>
+            </w:r>
+            <w:r>
+              <w:rPr>
+                <w:rStyle w:val="VerbatimChar"/>
+              </w:rPr>
+              <w:t xml:space="preserve">package-lock.json</w:t>
+            </w:r>
+          </w:p>
+        </w:tc>
+      </w:tr>
+      <w:tr>
+        <w:tc>
+          <w:p>
+            <w:pPr>
+              <w:pStyle w:val="Compact"/>
+              <w:jc w:val="left"/>
+            </w:pPr>
+            <w:r>
+              <w:rPr>
+                <w:rStyle w:val="VerbatimChar"/>
+              </w:rPr>
+              <w:t xml:space="preserve">feature/postman-tests</w:t>
+            </w:r>
+          </w:p>
+        </w:tc>
+        <w:tc>
+          <w:p>
+            <w:pPr>
+              <w:pStyle w:val="Compact"/>
+              <w:jc w:val="left"/>
+            </w:pPr>
+            <w:r>
+              <w:t xml:space="preserve">SCRUM-265</w:t>
+            </w:r>
+          </w:p>
+        </w:tc>
+        <w:tc>
+          <w:p>
+            <w:pPr>
+              <w:pStyle w:val="Compact"/>
+              <w:jc w:val="left"/>
+            </w:pPr>
+            <w:r>
+              <w:t xml:space="preserve">bbaf377</w:t>
+            </w:r>
+          </w:p>
+        </w:tc>
+        <w:tc>
+          <w:p>
+            <w:pPr>
+              <w:pStyle w:val="Compact"/>
+              <w:jc w:val="left"/>
+            </w:pPr>
+            <w:r>
+              <w:rPr>
+                <w:rStyle w:val="VerbatimChar"/>
+              </w:rPr>
+              <w:t xml:space="preserve">postman/*</w:t>
+            </w:r>
+          </w:p>
+        </w:tc>
+      </w:tr>
+      <w:tr>
+        <w:tc>
+          <w:p>
+            <w:pPr>
+              <w:pStyle w:val="Compact"/>
+              <w:jc w:val="left"/>
+            </w:pPr>
+            <w:r>
+              <w:rPr>
+                <w:rStyle w:val="VerbatimChar"/>
+              </w:rPr>
+              <w:t xml:space="preserve">feature/aws-cicd</w:t>
+            </w:r>
+          </w:p>
+        </w:tc>
+        <w:tc>
+          <w:p>
+            <w:pPr>
+              <w:pStyle w:val="Compact"/>
+              <w:jc w:val="left"/>
+            </w:pPr>
+            <w:r>
+              <w:t xml:space="preserve">SCRUM-266</w:t>
+            </w:r>
+          </w:p>
+        </w:tc>
+        <w:tc>
+          <w:p>
+            <w:pPr>
+              <w:pStyle w:val="Compact"/>
+              <w:jc w:val="left"/>
+            </w:pPr>
+            <w:r>
+              <w:t xml:space="preserve">ba00223</w:t>
+            </w:r>
+          </w:p>
+        </w:tc>
+        <w:tc>
+          <w:p>
+            <w:pPr>
+              <w:pStyle w:val="Compact"/>
+              <w:jc w:val="left"/>
+            </w:pPr>
+            <w:r>
+              <w:rPr>
+                <w:rStyle w:val="VerbatimChar"/>
+              </w:rPr>
+              <w:t xml:space="preserve">DEPLOYMENT.md</w:t>
+            </w:r>
+            <w:r>
+              <w:t xml:space="preserve">,</w:t>
+            </w:r>
+            <w:r>
+              <w:t xml:space="preserve"> </w:t>
+            </w:r>
+            <w:r>
+              <w:rPr>
+                <w:rStyle w:val="VerbatimChar"/>
+              </w:rPr>
+              <w:t xml:space="preserve">arch.png</w:t>
+            </w:r>
+          </w:p>
+        </w:tc>
+      </w:tr>
+      <w:tr>
+        <w:tc>
+          <w:p>
+            <w:pPr>
+              <w:pStyle w:val="Compact"/>
+              <w:jc w:val="left"/>
+            </w:pPr>
+            <w:r>
+              <w:rPr>
+                <w:rStyle w:val="VerbatimChar"/>
+              </w:rPr>
+              <w:t xml:space="preserve">docs/assignment2</w:t>
+            </w:r>
+          </w:p>
+        </w:tc>
+        <w:tc>
+          <w:p/>
+        </w:tc>
+        <w:tc>
+          <w:p/>
+        </w:tc>
+        <w:tc>
+          <w:p/>
+        </w:tc>
+      </w:tr>
+    </w:tbl>
     <w:sectPr/>
   </w:body>
 </w:document>

</xml_diff>

<commit_message>
docs: playbook - stacked code branches + verified CI (40 passing)
</commit_message>
<xml_diff>
--- a/TicketHub_Project_Playbook.docx
+++ b/TicketHub_Project_Playbook.docx
@@ -4865,17 +4865,129 @@
       </w:r>
       <w:bookmarkEnd w:id="49"/>
     </w:p>
+    <w:p>
+      <w:pPr>
+        <w:pStyle w:val="FirstParagraph"/>
+      </w:pPr>
+      <w:r>
+        <w:t xml:space="preserve">The 3</w:t>
+      </w:r>
+      <w:r>
+        <w:t xml:space="preserve"> </w:t>
+      </w:r>
+      <w:r>
+        <w:rPr>
+          <w:b/>
+        </w:rPr>
+        <w:t xml:space="preserve">code</w:t>
+      </w:r>
+      <w:r>
+        <w:t xml:space="preserve"> </w:t>
+      </w:r>
+      <w:r>
+        <w:t xml:space="preserve">branches are</w:t>
+      </w:r>
+      <w:r>
+        <w:t xml:space="preserve"> </w:t>
+      </w:r>
+      <w:r>
+        <w:rPr>
+          <w:b/>
+        </w:rPr>
+        <w:t xml:space="preserve">stacked</w:t>
+      </w:r>
+      <w:r>
+        <w:t xml:space="preserve"> </w:t>
+      </w:r>
+      <w:r>
+        <w:t xml:space="preserve">(</w:t>
+      </w:r>
+      <w:r>
+        <w:rPr>
+          <w:rStyle w:val="VerbatimChar"/>
+        </w:rPr>
+        <w:t xml:space="preserve">oop ⊂ design-patterns ⊂ unit-testing</w:t>
+      </w:r>
+      <w:r>
+        <w:t xml:space="preserve">) so the</w:t>
+      </w:r>
+      <w:r>
+        <w:t xml:space="preserve"> </w:t>
+      </w:r>
+      <w:r>
+        <w:t xml:space="preserve">tests have the code they import — otherwise the unit-testing PR would fail CI with</w:t>
+      </w:r>
+      <w:r>
+        <w:t xml:space="preserve"> </w:t>
+      </w:r>
+      <w:r>
+        <w:t xml:space="preserve">“</w:t>
+      </w:r>
+      <w:r>
+        <w:t xml:space="preserve">Cannot find module</w:t>
+      </w:r>
+      <w:r>
+        <w:t xml:space="preserve">”</w:t>
+      </w:r>
+      <w:r>
+        <w:t xml:space="preserve">. CI verified:</w:t>
+      </w:r>
+      <w:r>
+        <w:t xml:space="preserve"> </w:t>
+      </w:r>
+      <w:r>
+        <w:rPr>
+          <w:rStyle w:val="VerbatimChar"/>
+        </w:rPr>
+        <w:t xml:space="preserve">npm test</w:t>
+      </w:r>
+      <w:r>
+        <w:t xml:space="preserve"> </w:t>
+      </w:r>
+      <w:r>
+        <w:t xml:space="preserve">→</w:t>
+      </w:r>
+      <w:r>
+        <w:t xml:space="preserve"> </w:t>
+      </w:r>
+      <w:r>
+        <w:rPr>
+          <w:b/>
+        </w:rPr>
+        <w:t xml:space="preserve">40 passing</w:t>
+      </w:r>
+      <w:r>
+        <w:t xml:space="preserve"> </w:t>
+      </w:r>
+      <w:r>
+        <w:t xml:space="preserve">on</w:t>
+      </w:r>
+      <w:r>
+        <w:t xml:space="preserve"> </w:t>
+      </w:r>
+      <w:r>
+        <w:rPr>
+          <w:rStyle w:val="VerbatimChar"/>
+        </w:rPr>
+        <w:t xml:space="preserve">feature/unit-testing</w:t>
+      </w:r>
+      <w:r>
+        <w:t xml:space="preserve">.</w:t>
+      </w:r>
+    </w:p>
     <w:tbl>
       <w:tblPr>
         <w:tblStyle w:val="Table"/>
-        <w:tblW w:type="pct" w:w="5000.0"/>
+        <w:tblW w:type="pct" w:w="4999.999999999999"/>
         <w:tblLook w:firstRow="1"/>
       </w:tblPr>
       <w:tblGrid>
-        <w:gridCol w:w="1980"/>
-        <w:gridCol w:w="1980"/>
-        <w:gridCol w:w="1980"/>
-        <w:gridCol w:w="1980"/>
+        <w:gridCol w:w="1320"/>
+        <w:gridCol w:w="1320"/>
+        <w:gridCol w:w="1320"/>
+        <w:gridCol w:w="1320"/>
+        <w:gridCol w:w="1320"/>
+        <w:gridCol w:w="1320"/>
       </w:tblGrid>
       <w:tr>
         <w:trPr>
@@ -4945,7 +5057,41 @@
               <w:jc w:val="left"/>
             </w:pPr>
             <w:r>
+              <w:t xml:space="preserve">Built on</w:t>
+            </w:r>
+          </w:p>
+        </w:tc>
+        <w:tc>
+          <w:tcPr>
+            <w:tcBorders>
+              <w:bottom w:val="single"/>
+            </w:tcBorders>
+            <w:vAlign w:val="bottom"/>
+          </w:tcPr>
+          <w:p>
+            <w:pPr>
+              <w:pStyle w:val="Compact"/>
+              <w:jc w:val="left"/>
+            </w:pPr>
+            <w:r>
               <w:t xml:space="preserve">Contents</w:t>
+            </w:r>
+          </w:p>
+        </w:tc>
+        <w:tc>
+          <w:tcPr>
+            <w:tcBorders>
+              <w:bottom w:val="single"/>
+            </w:tcBorders>
+            <w:vAlign w:val="bottom"/>
+          </w:tcPr>
+          <w:p>
+            <w:pPr>
+              <w:pStyle w:val="Compact"/>
+              <w:jc w:val="left"/>
+            </w:pPr>
+            <w:r>
+              <w:t xml:space="preserve">CI</w:t>
             </w:r>
           </w:p>
         </w:tc>
@@ -4983,7 +5129,7 @@
               <w:jc w:val="left"/>
             </w:pPr>
             <w:r>
-              <w:t xml:space="preserve">1022dc0</w:t>
+              <w:t xml:space="preserve">e7f5fb0</w:t>
             </w:r>
           </w:p>
         </w:tc>
@@ -4994,6 +5140,17 @@
               <w:jc w:val="left"/>
             </w:pPr>
             <w:r>
+              <w:t xml:space="preserve">main</w:t>
+            </w:r>
+          </w:p>
+        </w:tc>
+        <w:tc>
+          <w:p>
+            <w:pPr>
+              <w:pStyle w:val="Compact"/>
+              <w:jc w:val="left"/>
+            </w:pPr>
+            <w:r>
               <w:rPr>
                 <w:rStyle w:val="VerbatimChar"/>
               </w:rPr>
@@ -5013,6 +5170,17 @@
                 <w:rStyle w:val="VerbatimChar"/>
               </w:rPr>
               <w:t xml:space="preserve">authController.js</w:t>
+            </w:r>
+          </w:p>
+        </w:tc>
+        <w:tc>
+          <w:p>
+            <w:pPr>
+              <w:pStyle w:val="Compact"/>
+              <w:jc w:val="left"/>
+            </w:pPr>
+            <w:r>
+              <w:t xml:space="preserve">green (tests skipped — no test script)</w:t>
             </w:r>
           </w:p>
         </w:tc>
@@ -5050,7 +5218,7 @@
               <w:jc w:val="left"/>
             </w:pPr>
             <w:r>
-              <w:t xml:space="preserve">31ba951</w:t>
+              <w:t xml:space="preserve">40aacd3</w:t>
             </w:r>
           </w:p>
         </w:tc>
@@ -5061,56 +5229,7 @@
               <w:jc w:val="left"/>
             </w:pPr>
             <w:r>
-              <w:rPr>
-                <w:rStyle w:val="VerbatimChar"/>
-              </w:rPr>
-              <w:t xml:space="preserve">backend/patterns/*</w:t>
-            </w:r>
-            <w:r>
-              <w:t xml:space="preserve"> </w:t>
-            </w:r>
-            <w:r>
-              <w:t xml:space="preserve">+</w:t>
-            </w:r>
-            <w:r>
-              <w:t xml:space="preserve"> </w:t>
-            </w:r>
-            <w:r>
-              <w:rPr>
-                <w:rStyle w:val="VerbatimChar"/>
-              </w:rPr>
-              <w:t xml:space="preserve">services/bookingService.js</w:t>
-            </w:r>
-            <w:r>
-              <w:t xml:space="preserve"> </w:t>
-            </w:r>
-            <w:r>
-              <w:t xml:space="preserve">+ controllers +</w:t>
-            </w:r>
-            <w:r>
-              <w:t xml:space="preserve"> </w:t>
-            </w:r>
-            <w:r>
-              <w:rPr>
-                <w:rStyle w:val="VerbatimChar"/>
-              </w:rPr>
-              <w:t xml:space="preserve">eventRoutes.js</w:t>
-            </w:r>
-          </w:p>
-        </w:tc>
-      </w:tr>
-      <w:tr>
-        <w:tc>
-          <w:p>
-            <w:pPr>
-              <w:pStyle w:val="Compact"/>
-              <w:jc w:val="left"/>
-            </w:pPr>
-            <w:r>
-              <w:rPr>
-                <w:rStyle w:val="VerbatimChar"/>
-              </w:rPr>
-              <w:t xml:space="preserve">feature/unit-testing</w:t>
+              <w:t xml:space="preserve">oop</w:t>
             </w:r>
           </w:p>
         </w:tc>
@@ -5121,202 +5240,9 @@
               <w:jc w:val="left"/>
             </w:pPr>
             <w:r>
-              <w:t xml:space="preserve">SCRUM-264</w:t>
+              <w:t xml:space="preserve">`backe</w:t>
             </w:r>
           </w:p>
-        </w:tc>
-        <w:tc>
-          <w:p>
-            <w:pPr>
-              <w:pStyle w:val="Compact"/>
-              <w:jc w:val="left"/>
-            </w:pPr>
-            <w:r>
-              <w:t xml:space="preserve">27e0ccf</w:t>
-            </w:r>
-          </w:p>
-        </w:tc>
-        <w:tc>
-          <w:p>
-            <w:pPr>
-              <w:pStyle w:val="Compact"/>
-              <w:jc w:val="left"/>
-            </w:pPr>
-            <w:r>
-              <w:rPr>
-                <w:rStyle w:val="VerbatimChar"/>
-              </w:rPr>
-              <w:t xml:space="preserve">backend/test/*</w:t>
-            </w:r>
-            <w:r>
-              <w:t xml:space="preserve"> </w:t>
-            </w:r>
-            <w:r>
-              <w:t xml:space="preserve">+</w:t>
-            </w:r>
-            <w:r>
-              <w:t xml:space="preserve"> </w:t>
-            </w:r>
-            <w:r>
-              <w:rPr>
-                <w:rStyle w:val="VerbatimChar"/>
-              </w:rPr>
-              <w:t xml:space="preserve">package.json</w:t>
-            </w:r>
-            <w:r>
-              <w:t xml:space="preserve"> </w:t>
-            </w:r>
-            <w:r>
-              <w:t xml:space="preserve">/</w:t>
-            </w:r>
-            <w:r>
-              <w:t xml:space="preserve"> </w:t>
-            </w:r>
-            <w:r>
-              <w:rPr>
-                <w:rStyle w:val="VerbatimChar"/>
-              </w:rPr>
-              <w:t xml:space="preserve">package-lock.json</w:t>
-            </w:r>
-          </w:p>
-        </w:tc>
-      </w:tr>
-      <w:tr>
-        <w:tc>
-          <w:p>
-            <w:pPr>
-              <w:pStyle w:val="Compact"/>
-              <w:jc w:val="left"/>
-            </w:pPr>
-            <w:r>
-              <w:rPr>
-                <w:rStyle w:val="VerbatimChar"/>
-              </w:rPr>
-              <w:t xml:space="preserve">feature/postman-tests</w:t>
-            </w:r>
-          </w:p>
-        </w:tc>
-        <w:tc>
-          <w:p>
-            <w:pPr>
-              <w:pStyle w:val="Compact"/>
-              <w:jc w:val="left"/>
-            </w:pPr>
-            <w:r>
-              <w:t xml:space="preserve">SCRUM-265</w:t>
-            </w:r>
-          </w:p>
-        </w:tc>
-        <w:tc>
-          <w:p>
-            <w:pPr>
-              <w:pStyle w:val="Compact"/>
-              <w:jc w:val="left"/>
-            </w:pPr>
-            <w:r>
-              <w:t xml:space="preserve">bbaf377</w:t>
-            </w:r>
-          </w:p>
-        </w:tc>
-        <w:tc>
-          <w:p>
-            <w:pPr>
-              <w:pStyle w:val="Compact"/>
-              <w:jc w:val="left"/>
-            </w:pPr>
-            <w:r>
-              <w:rPr>
-                <w:rStyle w:val="VerbatimChar"/>
-              </w:rPr>
-              <w:t xml:space="preserve">postman/*</w:t>
-            </w:r>
-          </w:p>
-        </w:tc>
-      </w:tr>
-      <w:tr>
-        <w:tc>
-          <w:p>
-            <w:pPr>
-              <w:pStyle w:val="Compact"/>
-              <w:jc w:val="left"/>
-            </w:pPr>
-            <w:r>
-              <w:rPr>
-                <w:rStyle w:val="VerbatimChar"/>
-              </w:rPr>
-              <w:t xml:space="preserve">feature/aws-cicd</w:t>
-            </w:r>
-          </w:p>
-        </w:tc>
-        <w:tc>
-          <w:p>
-            <w:pPr>
-              <w:pStyle w:val="Compact"/>
-              <w:jc w:val="left"/>
-            </w:pPr>
-            <w:r>
-              <w:t xml:space="preserve">SCRUM-266</w:t>
-            </w:r>
-          </w:p>
-        </w:tc>
-        <w:tc>
-          <w:p>
-            <w:pPr>
-              <w:pStyle w:val="Compact"/>
-              <w:jc w:val="left"/>
-            </w:pPr>
-            <w:r>
-              <w:t xml:space="preserve">ba00223</w:t>
-            </w:r>
-          </w:p>
-        </w:tc>
-        <w:tc>
-          <w:p>
-            <w:pPr>
-              <w:pStyle w:val="Compact"/>
-              <w:jc w:val="left"/>
-            </w:pPr>
-            <w:r>
-              <w:rPr>
-                <w:rStyle w:val="VerbatimChar"/>
-              </w:rPr>
-              <w:t xml:space="preserve">DEPLOYMENT.md</w:t>
-            </w:r>
-            <w:r>
-              <w:t xml:space="preserve">,</w:t>
-            </w:r>
-            <w:r>
-              <w:t xml:space="preserve"> </w:t>
-            </w:r>
-            <w:r>
-              <w:rPr>
-                <w:rStyle w:val="VerbatimChar"/>
-              </w:rPr>
-              <w:t xml:space="preserve">arch.png</w:t>
-            </w:r>
-          </w:p>
-        </w:tc>
-      </w:tr>
-      <w:tr>
-        <w:tc>
-          <w:p>
-            <w:pPr>
-              <w:pStyle w:val="Compact"/>
-              <w:jc w:val="left"/>
-            </w:pPr>
-            <w:r>
-              <w:rPr>
-                <w:rStyle w:val="VerbatimChar"/>
-              </w:rPr>
-              <w:t xml:space="preserve">docs/assignment2</w:t>
-            </w:r>
-          </w:p>
-        </w:tc>
-        <w:tc>
-          <w:p/>
-        </w:tc>
-        <w:tc>
-          <w:p/>
         </w:tc>
         <w:tc>
           <w:p/>

</xml_diff>

<commit_message>
docs: complete playbook + branch-protection (require CI before merge)
</commit_message>
<xml_diff>
--- a/TicketHub_Project_Playbook.docx
+++ b/TicketHub_Project_Playbook.docx
@@ -4930,7 +4930,7 @@
         <w:t xml:space="preserve">”</w:t>
       </w:r>
       <w:r>
-        <w:t xml:space="preserve">. CI verified:</w:t>
+        <w:t xml:space="preserve">. Verified locally:</w:t>
       </w:r>
       <w:r>
         <w:t xml:space="preserve"> </w:t>
@@ -4957,22 +4957,34 @@
         <w:t xml:space="preserve">40 passing</w:t>
       </w:r>
       <w:r>
-        <w:t xml:space="preserve"> </w:t>
-      </w:r>
-      <w:r>
-        <w:t xml:space="preserve">on</w:t>
-      </w:r>
-      <w:r>
-        <w:t xml:space="preserve"> </w:t>
-      </w:r>
-      <w:r>
-        <w:rPr>
-          <w:rStyle w:val="VerbatimChar"/>
-        </w:rPr>
-        <w:t xml:space="preserve">feature/unit-testing</w:t>
-      </w:r>
-      <w:r>
-        <w:t xml:space="preserve">.</w:t>
+        <w:t xml:space="preserve">, frontend</w:t>
+      </w:r>
+      <w:r>
+        <w:t xml:space="preserve"> </w:t>
+      </w:r>
+      <w:r>
+        <w:rPr>
+          <w:rStyle w:val="VerbatimChar"/>
+        </w:rPr>
+        <w:t xml:space="preserve">npm run build</w:t>
+      </w:r>
+      <w:r>
+        <w:t xml:space="preserve"> </w:t>
+      </w:r>
+      <w:r>
+        <w:t xml:space="preserve">ok, and merging all 6 branches →</w:t>
+      </w:r>
+      <w:r>
+        <w:t xml:space="preserve"> </w:t>
+      </w:r>
+      <w:r>
+        <w:rPr>
+          <w:b/>
+        </w:rPr>
+        <w:t xml:space="preserve">0 conflicts</w:t>
+      </w:r>
+      <w:r>
+        <w:t xml:space="preserve">, 40 passing, all modules load.</w:t>
       </w:r>
     </w:p>
     <w:tbl>
@@ -5180,7 +5192,7 @@
               <w:jc w:val="left"/>
             </w:pPr>
             <w:r>
-              <w:t xml:space="preserve">green (tests skipped — no test script)</w:t>
+              <w:t xml:space="preserve">green (tests skipped)</w:t>
             </w:r>
           </w:p>
         </w:tc>
@@ -5240,15 +5252,2259 @@
               <w:jc w:val="left"/>
             </w:pPr>
             <w:r>
-              <w:t xml:space="preserve">`backe</w:t>
-            </w:r>
-          </w:p>
-        </w:tc>
-        <w:tc>
-          <w:p/>
+              <w:rPr>
+                <w:rStyle w:val="VerbatimChar"/>
+              </w:rPr>
+              <w:t xml:space="preserve">patterns/*</w:t>
+            </w:r>
+            <w:r>
+              <w:t xml:space="preserve"> </w:t>
+            </w:r>
+            <w:r>
+              <w:t xml:space="preserve">+</w:t>
+            </w:r>
+            <w:r>
+              <w:t xml:space="preserve"> </w:t>
+            </w:r>
+            <w:r>
+              <w:rPr>
+                <w:rStyle w:val="VerbatimChar"/>
+              </w:rPr>
+              <w:t xml:space="preserve">services/</w:t>
+            </w:r>
+            <w:r>
+              <w:t xml:space="preserve"> </w:t>
+            </w:r>
+            <w:r>
+              <w:t xml:space="preserve">+ controllers +</w:t>
+            </w:r>
+            <w:r>
+              <w:t xml:space="preserve"> </w:t>
+            </w:r>
+            <w:r>
+              <w:rPr>
+                <w:rStyle w:val="VerbatimChar"/>
+              </w:rPr>
+              <w:t xml:space="preserve">eventRoutes.js</w:t>
+            </w:r>
+          </w:p>
+        </w:tc>
+        <w:tc>
+          <w:p>
+            <w:pPr>
+              <w:pStyle w:val="Compact"/>
+              <w:jc w:val="left"/>
+            </w:pPr>
+            <w:r>
+              <w:t xml:space="preserve">green (tests skipped)</w:t>
+            </w:r>
+          </w:p>
+        </w:tc>
+      </w:tr>
+      <w:tr>
+        <w:tc>
+          <w:p>
+            <w:pPr>
+              <w:pStyle w:val="Compact"/>
+              <w:jc w:val="left"/>
+            </w:pPr>
+            <w:r>
+              <w:rPr>
+                <w:rStyle w:val="VerbatimChar"/>
+              </w:rPr>
+              <w:t xml:space="preserve">feature/unit-testing</w:t>
+            </w:r>
+          </w:p>
+        </w:tc>
+        <w:tc>
+          <w:p>
+            <w:pPr>
+              <w:pStyle w:val="Compact"/>
+              <w:jc w:val="left"/>
+            </w:pPr>
+            <w:r>
+              <w:t xml:space="preserve">SCRUM-264</w:t>
+            </w:r>
+          </w:p>
+        </w:tc>
+        <w:tc>
+          <w:p>
+            <w:pPr>
+              <w:pStyle w:val="Compact"/>
+              <w:jc w:val="left"/>
+            </w:pPr>
+            <w:r>
+              <w:t xml:space="preserve">7ac1d08</w:t>
+            </w:r>
+          </w:p>
+        </w:tc>
+        <w:tc>
+          <w:p>
+            <w:pPr>
+              <w:pStyle w:val="Compact"/>
+              <w:jc w:val="left"/>
+            </w:pPr>
+            <w:r>
+              <w:t xml:space="preserve">design-patterns</w:t>
+            </w:r>
+          </w:p>
+        </w:tc>
+        <w:tc>
+          <w:p>
+            <w:pPr>
+              <w:pStyle w:val="Compact"/>
+              <w:jc w:val="left"/>
+            </w:pPr>
+            <w:r>
+              <w:rPr>
+                <w:rStyle w:val="VerbatimChar"/>
+              </w:rPr>
+              <w:t xml:space="preserve">backend/test/*</w:t>
+            </w:r>
+            <w:r>
+              <w:t xml:space="preserve"> </w:t>
+            </w:r>
+            <w:r>
+              <w:t xml:space="preserve">+</w:t>
+            </w:r>
+            <w:r>
+              <w:t xml:space="preserve"> </w:t>
+            </w:r>
+            <w:r>
+              <w:rPr>
+                <w:rStyle w:val="VerbatimChar"/>
+              </w:rPr>
+              <w:t xml:space="preserve">package.json</w:t>
+            </w:r>
+            <w:r>
+              <w:t xml:space="preserve">/lock</w:t>
+            </w:r>
+          </w:p>
+        </w:tc>
+        <w:tc>
+          <w:p>
+            <w:pPr>
+              <w:pStyle w:val="Compact"/>
+              <w:jc w:val="left"/>
+            </w:pPr>
+            <w:r>
+              <w:t xml:space="preserve">green (</w:t>
+            </w:r>
+            <w:r>
+              <w:rPr>
+                <w:b/>
+              </w:rPr>
+              <w:t xml:space="preserve">runs 40 tests</w:t>
+            </w:r>
+            <w:r>
+              <w:t xml:space="preserve">)</w:t>
+            </w:r>
+          </w:p>
+        </w:tc>
+      </w:tr>
+      <w:tr>
+        <w:tc>
+          <w:p>
+            <w:pPr>
+              <w:pStyle w:val="Compact"/>
+              <w:jc w:val="left"/>
+            </w:pPr>
+            <w:r>
+              <w:rPr>
+                <w:rStyle w:val="VerbatimChar"/>
+              </w:rPr>
+              <w:t xml:space="preserve">feature/postman-tests</w:t>
+            </w:r>
+          </w:p>
+        </w:tc>
+        <w:tc>
+          <w:p>
+            <w:pPr>
+              <w:pStyle w:val="Compact"/>
+              <w:jc w:val="left"/>
+            </w:pPr>
+            <w:r>
+              <w:t xml:space="preserve">SCRUM-265</w:t>
+            </w:r>
+          </w:p>
+        </w:tc>
+        <w:tc>
+          <w:p>
+            <w:pPr>
+              <w:pStyle w:val="Compact"/>
+              <w:jc w:val="left"/>
+            </w:pPr>
+            <w:r>
+              <w:t xml:space="preserve">bbaf377</w:t>
+            </w:r>
+          </w:p>
+        </w:tc>
+        <w:tc>
+          <w:p>
+            <w:pPr>
+              <w:pStyle w:val="Compact"/>
+              <w:jc w:val="left"/>
+            </w:pPr>
+            <w:r>
+              <w:t xml:space="preserve">main</w:t>
+            </w:r>
+          </w:p>
+        </w:tc>
+        <w:tc>
+          <w:p>
+            <w:pPr>
+              <w:pStyle w:val="Compact"/>
+              <w:jc w:val="left"/>
+            </w:pPr>
+            <w:r>
+              <w:rPr>
+                <w:rStyle w:val="VerbatimChar"/>
+              </w:rPr>
+              <w:t xml:space="preserve">postman/*</w:t>
+            </w:r>
+          </w:p>
+        </w:tc>
+        <w:tc>
+          <w:p>
+            <w:pPr>
+              <w:pStyle w:val="Compact"/>
+              <w:jc w:val="left"/>
+            </w:pPr>
+            <w:r>
+              <w:t xml:space="preserve">green (tests skipped)</w:t>
+            </w:r>
+          </w:p>
+        </w:tc>
+      </w:tr>
+      <w:tr>
+        <w:tc>
+          <w:p>
+            <w:pPr>
+              <w:pStyle w:val="Compact"/>
+              <w:jc w:val="left"/>
+            </w:pPr>
+            <w:r>
+              <w:rPr>
+                <w:rStyle w:val="VerbatimChar"/>
+              </w:rPr>
+              <w:t xml:space="preserve">feature/aws-cicd</w:t>
+            </w:r>
+          </w:p>
+        </w:tc>
+        <w:tc>
+          <w:p>
+            <w:pPr>
+              <w:pStyle w:val="Compact"/>
+              <w:jc w:val="left"/>
+            </w:pPr>
+            <w:r>
+              <w:t xml:space="preserve">SCRUM-266</w:t>
+            </w:r>
+          </w:p>
+        </w:tc>
+        <w:tc>
+          <w:p>
+            <w:pPr>
+              <w:pStyle w:val="Compact"/>
+              <w:jc w:val="left"/>
+            </w:pPr>
+            <w:r>
+              <w:t xml:space="preserve">ba00223</w:t>
+            </w:r>
+          </w:p>
+        </w:tc>
+        <w:tc>
+          <w:p>
+            <w:pPr>
+              <w:pStyle w:val="Compact"/>
+              <w:jc w:val="left"/>
+            </w:pPr>
+            <w:r>
+              <w:t xml:space="preserve">main</w:t>
+            </w:r>
+          </w:p>
+        </w:tc>
+        <w:tc>
+          <w:p>
+            <w:pPr>
+              <w:pStyle w:val="Compact"/>
+              <w:jc w:val="left"/>
+            </w:pPr>
+            <w:r>
+              <w:rPr>
+                <w:rStyle w:val="VerbatimChar"/>
+              </w:rPr>
+              <w:t xml:space="preserve">DEPLOYMENT.md</w:t>
+            </w:r>
+            <w:r>
+              <w:t xml:space="preserve">,</w:t>
+            </w:r>
+            <w:r>
+              <w:t xml:space="preserve"> </w:t>
+            </w:r>
+            <w:r>
+              <w:rPr>
+                <w:rStyle w:val="VerbatimChar"/>
+              </w:rPr>
+              <w:t xml:space="preserve">arch.png</w:t>
+            </w:r>
+          </w:p>
+        </w:tc>
+        <w:tc>
+          <w:p>
+            <w:pPr>
+              <w:pStyle w:val="Compact"/>
+              <w:jc w:val="left"/>
+            </w:pPr>
+            <w:r>
+              <w:t xml:space="preserve">green (tests skipped)</w:t>
+            </w:r>
+          </w:p>
+        </w:tc>
+      </w:tr>
+      <w:tr>
+        <w:tc>
+          <w:p>
+            <w:pPr>
+              <w:pStyle w:val="Compact"/>
+              <w:jc w:val="left"/>
+            </w:pPr>
+            <w:r>
+              <w:rPr>
+                <w:rStyle w:val="VerbatimChar"/>
+              </w:rPr>
+              <w:t xml:space="preserve">docs/assignment2</w:t>
+            </w:r>
+          </w:p>
+        </w:tc>
+        <w:tc>
+          <w:p>
+            <w:pPr>
+              <w:pStyle w:val="Compact"/>
+              <w:jc w:val="left"/>
+            </w:pPr>
+            <w:r>
+              <w:t xml:space="preserve">SCRUM-267</w:t>
+            </w:r>
+          </w:p>
+        </w:tc>
+        <w:tc>
+          <w:p>
+            <w:pPr>
+              <w:pStyle w:val="Compact"/>
+              <w:jc w:val="left"/>
+            </w:pPr>
+            <w:r>
+              <w:t xml:space="preserve">0902484</w:t>
+            </w:r>
+          </w:p>
+        </w:tc>
+        <w:tc>
+          <w:p>
+            <w:pPr>
+              <w:pStyle w:val="Compact"/>
+              <w:jc w:val="left"/>
+            </w:pPr>
+            <w:r>
+              <w:t xml:space="preserve">main</w:t>
+            </w:r>
+          </w:p>
+        </w:tc>
+        <w:tc>
+          <w:p>
+            <w:pPr>
+              <w:pStyle w:val="Compact"/>
+              <w:jc w:val="left"/>
+            </w:pPr>
+            <w:r>
+              <w:t xml:space="preserve">reports (</w:t>
+            </w:r>
+            <w:r>
+              <w:rPr>
+                <w:rStyle w:val="VerbatimChar"/>
+              </w:rPr>
+              <w:t xml:space="preserve">.docx</w:t>
+            </w:r>
+            <w:r>
+              <w:t xml:space="preserve">), diagrams (</w:t>
+            </w:r>
+            <w:r>
+              <w:rPr>
+                <w:rStyle w:val="VerbatimChar"/>
+              </w:rPr>
+              <w:t xml:space="preserve">.drawio</w:t>
+            </w:r>
+            <w:r>
+              <w:t xml:space="preserve">), screenshots</w:t>
+            </w:r>
+          </w:p>
+        </w:tc>
+        <w:tc>
+          <w:p>
+            <w:pPr>
+              <w:pStyle w:val="Compact"/>
+              <w:jc w:val="left"/>
+            </w:pPr>
+            <w:r>
+              <w:t xml:space="preserve">green (tests skipped)</w:t>
+            </w:r>
+          </w:p>
         </w:tc>
       </w:tr>
     </w:tbl>
+    <w:p>
+      <w:pPr>
+        <w:pStyle w:val="BlockText"/>
+      </w:pPr>
+      <w:r>
+        <w:t xml:space="preserve">Branches without a</w:t>
+      </w:r>
+      <w:r>
+        <w:t xml:space="preserve"> </w:t>
+      </w:r>
+      <w:r>
+        <w:rPr>
+          <w:rStyle w:val="VerbatimChar"/>
+        </w:rPr>
+        <w:t xml:space="preserve">test</w:t>
+      </w:r>
+      <w:r>
+        <w:t xml:space="preserve"> </w:t>
+      </w:r>
+      <w:r>
+        <w:t xml:space="preserve">script skip the test step (</w:t>
+      </w:r>
+      <w:r>
+        <w:rPr>
+          <w:rStyle w:val="VerbatimChar"/>
+        </w:rPr>
+        <w:t xml:space="preserve">npm test --if-present</w:t>
+      </w:r>
+      <w:r>
+        <w:t xml:space="preserve">) and pass on</w:t>
+      </w:r>
+      <w:r>
+        <w:t xml:space="preserve"> </w:t>
+      </w:r>
+      <w:r>
+        <w:t xml:space="preserve">the frontend build. Only</w:t>
+      </w:r>
+      <w:r>
+        <w:t xml:space="preserve"> </w:t>
+      </w:r>
+      <w:r>
+        <w:rPr>
+          <w:rStyle w:val="VerbatimChar"/>
+        </w:rPr>
+        <w:t xml:space="preserve">feature/unit-testing</w:t>
+      </w:r>
+      <w:r>
+        <w:t xml:space="preserve"> </w:t>
+      </w:r>
+      <w:r>
+        <w:t xml:space="preserve">runs the 40 tests.</w:t>
+      </w:r>
+      <w:r>
+        <w:t xml:space="preserve"> </w:t>
+      </w:r>
+      <w:r>
+        <w:rPr>
+          <w:b/>
+        </w:rPr>
+        <w:t xml:space="preserve">Merge the code</w:t>
+      </w:r>
+      <w:r>
+        <w:rPr>
+          <w:b/>
+        </w:rPr>
+        <w:t xml:space="preserve"> </w:t>
+      </w:r>
+      <w:r>
+        <w:rPr>
+          <w:b/>
+        </w:rPr>
+        <w:t xml:space="preserve">branches in order</w:t>
+      </w:r>
+      <w:r>
+        <w:t xml:space="preserve"> </w:t>
+      </w:r>
+      <w:r>
+        <w:t xml:space="preserve">(oop → design-patterns → unit-testing) so each PR diff is clean.</w:t>
+      </w:r>
+    </w:p>
+    <w:p>
+      <w:pPr>
+        <w:pStyle w:val="Heading3"/>
+      </w:pPr>
+      <w:bookmarkStart w:id="50" w:name="X327755a1a476755a8bc616afa23f5af141db72b"/>
+      <w:r>
+        <w:t xml:space="preserve">event-ticket_3 (assignment_3) — full code on</w:t>
+      </w:r>
+      <w:r>
+        <w:t xml:space="preserve"> </w:t>
+      </w:r>
+      <w:r>
+        <w:rPr>
+          <w:rStyle w:val="VerbatimChar"/>
+        </w:rPr>
+        <w:t xml:space="preserve">main</w:t>
+      </w:r>
+      <w:r>
+        <w:t xml:space="preserve">; each branch has a task scaffold</w:t>
+      </w:r>
+      <w:bookmarkEnd w:id="50"/>
+    </w:p>
+    <w:p>
+      <w:pPr>
+        <w:pStyle w:val="FirstParagraph"/>
+      </w:pPr>
+      <w:r>
+        <w:rPr>
+          <w:rStyle w:val="VerbatimChar"/>
+        </w:rPr>
+        <w:t xml:space="preserve">main</w:t>
+      </w:r>
+      <w:r>
+        <w:t xml:space="preserve"> </w:t>
+      </w:r>
+      <w:r>
+        <w:t xml:space="preserve">already has the full code + test setup, so CI runs the 40 tests on every PR.</w:t>
+      </w:r>
+    </w:p>
+    <w:tbl>
+      <w:tblPr>
+        <w:tblStyle w:val="Table"/>
+        <w:tblW w:type="pct" w:w="0.0"/>
+        <w:tblLook w:firstRow="1"/>
+      </w:tblPr>
+      <w:tblGrid/>
+      <w:tr>
+        <w:trPr>
+          <w:cnfStyle w:firstRow="1"/>
+        </w:trPr>
+        <w:tc>
+          <w:tcPr>
+            <w:tcBorders>
+              <w:bottom w:val="single"/>
+            </w:tcBorders>
+            <w:vAlign w:val="bottom"/>
+          </w:tcPr>
+          <w:p>
+            <w:pPr>
+              <w:pStyle w:val="Compact"/>
+              <w:jc w:val="left"/>
+            </w:pPr>
+            <w:r>
+              <w:t xml:space="preserve">Branch</w:t>
+            </w:r>
+          </w:p>
+        </w:tc>
+        <w:tc>
+          <w:tcPr>
+            <w:tcBorders>
+              <w:bottom w:val="single"/>
+            </w:tcBorders>
+            <w:vAlign w:val="bottom"/>
+          </w:tcPr>
+          <w:p>
+            <w:pPr>
+              <w:pStyle w:val="Compact"/>
+              <w:jc w:val="left"/>
+            </w:pPr>
+            <w:r>
+              <w:t xml:space="preserve">Jira</w:t>
+            </w:r>
+          </w:p>
+        </w:tc>
+        <w:tc>
+          <w:tcPr>
+            <w:tcBorders>
+              <w:bottom w:val="single"/>
+            </w:tcBorders>
+            <w:vAlign w:val="bottom"/>
+          </w:tcPr>
+          <w:p>
+            <w:pPr>
+              <w:pStyle w:val="Compact"/>
+              <w:jc w:val="left"/>
+            </w:pPr>
+            <w:r>
+              <w:t xml:space="preserve">Marker file</w:t>
+            </w:r>
+          </w:p>
+        </w:tc>
+      </w:tr>
+      <w:tr>
+        <w:tc>
+          <w:p>
+            <w:pPr>
+              <w:pStyle w:val="Compact"/>
+              <w:jc w:val="left"/>
+            </w:pPr>
+            <w:r>
+              <w:rPr>
+                <w:rStyle w:val="VerbatimChar"/>
+              </w:rPr>
+              <w:t xml:space="preserve">feature/oop-principles</w:t>
+            </w:r>
+          </w:p>
+        </w:tc>
+        <w:tc>
+          <w:p>
+            <w:pPr>
+              <w:pStyle w:val="Compact"/>
+              <w:jc w:val="left"/>
+            </w:pPr>
+            <w:r>
+              <w:t xml:space="preserve">SCRUM-269</w:t>
+            </w:r>
+          </w:p>
+        </w:tc>
+        <w:tc>
+          <w:p>
+            <w:pPr>
+              <w:pStyle w:val="Compact"/>
+              <w:jc w:val="left"/>
+            </w:pPr>
+            <w:r>
+              <w:rPr>
+                <w:rStyle w:val="VerbatimChar"/>
+              </w:rPr>
+              <w:t xml:space="preserve">docs/tasks/feature_oop-principles.md</w:t>
+            </w:r>
+          </w:p>
+        </w:tc>
+      </w:tr>
+      <w:tr>
+        <w:tc>
+          <w:p>
+            <w:pPr>
+              <w:pStyle w:val="Compact"/>
+              <w:jc w:val="left"/>
+            </w:pPr>
+            <w:r>
+              <w:rPr>
+                <w:rStyle w:val="VerbatimChar"/>
+              </w:rPr>
+              <w:t xml:space="preserve">feature/design-patterns</w:t>
+            </w:r>
+          </w:p>
+        </w:tc>
+        <w:tc>
+          <w:p>
+            <w:pPr>
+              <w:pStyle w:val="Compact"/>
+              <w:jc w:val="left"/>
+            </w:pPr>
+            <w:r>
+              <w:t xml:space="preserve">SCRUM-271</w:t>
+            </w:r>
+          </w:p>
+        </w:tc>
+        <w:tc>
+          <w:p>
+            <w:pPr>
+              <w:pStyle w:val="Compact"/>
+              <w:jc w:val="left"/>
+            </w:pPr>
+            <w:r>
+              <w:rPr>
+                <w:rStyle w:val="VerbatimChar"/>
+              </w:rPr>
+              <w:t xml:space="preserve">docs/tasks/feature_design-patterns.md</w:t>
+            </w:r>
+          </w:p>
+        </w:tc>
+      </w:tr>
+      <w:tr>
+        <w:tc>
+          <w:p>
+            <w:pPr>
+              <w:pStyle w:val="Compact"/>
+              <w:jc w:val="left"/>
+            </w:pPr>
+            <w:r>
+              <w:rPr>
+                <w:rStyle w:val="VerbatimChar"/>
+              </w:rPr>
+              <w:t xml:space="preserve">feature/unit-testing</w:t>
+            </w:r>
+          </w:p>
+        </w:tc>
+        <w:tc>
+          <w:p>
+            <w:pPr>
+              <w:pStyle w:val="Compact"/>
+              <w:jc w:val="left"/>
+            </w:pPr>
+            <w:r>
+              <w:t xml:space="preserve">SCRUM-273</w:t>
+            </w:r>
+          </w:p>
+        </w:tc>
+        <w:tc>
+          <w:p>
+            <w:pPr>
+              <w:pStyle w:val="Compact"/>
+              <w:jc w:val="left"/>
+            </w:pPr>
+            <w:r>
+              <w:rPr>
+                <w:rStyle w:val="VerbatimChar"/>
+              </w:rPr>
+              <w:t xml:space="preserve">docs/tasks/feature_unit-testing.md</w:t>
+            </w:r>
+          </w:p>
+        </w:tc>
+      </w:tr>
+      <w:tr>
+        <w:tc>
+          <w:p>
+            <w:pPr>
+              <w:pStyle w:val="Compact"/>
+              <w:jc w:val="left"/>
+            </w:pPr>
+            <w:r>
+              <w:rPr>
+                <w:rStyle w:val="VerbatimChar"/>
+              </w:rPr>
+              <w:t xml:space="preserve">feature/postman-tests</w:t>
+            </w:r>
+          </w:p>
+        </w:tc>
+        <w:tc>
+          <w:p>
+            <w:pPr>
+              <w:pStyle w:val="Compact"/>
+              <w:jc w:val="left"/>
+            </w:pPr>
+            <w:r>
+              <w:t xml:space="preserve">SCRUM-274</w:t>
+            </w:r>
+          </w:p>
+        </w:tc>
+        <w:tc>
+          <w:p>
+            <w:pPr>
+              <w:pStyle w:val="Compact"/>
+              <w:jc w:val="left"/>
+            </w:pPr>
+            <w:r>
+              <w:rPr>
+                <w:rStyle w:val="VerbatimChar"/>
+              </w:rPr>
+              <w:t xml:space="preserve">docs/tasks/feature_postman-tests.md</w:t>
+            </w:r>
+          </w:p>
+        </w:tc>
+      </w:tr>
+      <w:tr>
+        <w:tc>
+          <w:p>
+            <w:pPr>
+              <w:pStyle w:val="Compact"/>
+              <w:jc w:val="left"/>
+            </w:pPr>
+            <w:r>
+              <w:rPr>
+                <w:rStyle w:val="VerbatimChar"/>
+              </w:rPr>
+              <w:t xml:space="preserve">feature/aws-cicd</w:t>
+            </w:r>
+          </w:p>
+        </w:tc>
+        <w:tc>
+          <w:p>
+            <w:pPr>
+              <w:pStyle w:val="Compact"/>
+              <w:jc w:val="left"/>
+            </w:pPr>
+            <w:r>
+              <w:t xml:space="preserve">SCRUM-272</w:t>
+            </w:r>
+          </w:p>
+        </w:tc>
+        <w:tc>
+          <w:p>
+            <w:pPr>
+              <w:pStyle w:val="Compact"/>
+              <w:jc w:val="left"/>
+            </w:pPr>
+            <w:r>
+              <w:rPr>
+                <w:rStyle w:val="VerbatimChar"/>
+              </w:rPr>
+              <w:t xml:space="preserve">docs/tasks/feature_aws-cicd.md</w:t>
+            </w:r>
+          </w:p>
+        </w:tc>
+      </w:tr>
+      <w:tr>
+        <w:tc>
+          <w:p>
+            <w:pPr>
+              <w:pStyle w:val="Compact"/>
+              <w:jc w:val="left"/>
+            </w:pPr>
+            <w:r>
+              <w:rPr>
+                <w:rStyle w:val="VerbatimChar"/>
+              </w:rPr>
+              <w:t xml:space="preserve">docs/assignment3</w:t>
+            </w:r>
+          </w:p>
+        </w:tc>
+        <w:tc>
+          <w:p>
+            <w:pPr>
+              <w:pStyle w:val="Compact"/>
+              <w:jc w:val="left"/>
+            </w:pPr>
+            <w:r>
+              <w:t xml:space="preserve">SCRUM-270</w:t>
+            </w:r>
+          </w:p>
+        </w:tc>
+        <w:tc>
+          <w:p>
+            <w:pPr>
+              <w:pStyle w:val="Compact"/>
+              <w:jc w:val="left"/>
+            </w:pPr>
+            <w:r>
+              <w:rPr>
+                <w:rStyle w:val="VerbatimChar"/>
+              </w:rPr>
+              <w:t xml:space="preserve">docs/tasks/docs_assignment3.md</w:t>
+            </w:r>
+          </w:p>
+        </w:tc>
+      </w:tr>
+    </w:tbl>
+    <w:p>
+      <w:pPr>
+        <w:pStyle w:val="Heading3"/>
+      </w:pPr>
+      <w:bookmarkStart w:id="51" w:name="finish-each-task-in-the-github-ui"/>
+      <w:r>
+        <w:t xml:space="preserve">Finish each task (in the GitHub UI)</w:t>
+      </w:r>
+      <w:bookmarkEnd w:id="51"/>
+    </w:p>
+    <w:p>
+      <w:pPr>
+        <w:numPr>
+          <w:ilvl w:val="0"/>
+          <w:numId w:val="1013"/>
+        </w:numPr>
+        <w:pStyle w:val="Compact"/>
+      </w:pPr>
+      <w:r>
+        <w:t xml:space="preserve">Move the Jira task</w:t>
+      </w:r>
+      <w:r>
+        <w:t xml:space="preserve"> </w:t>
+      </w:r>
+      <w:r>
+        <w:rPr>
+          <w:b/>
+        </w:rPr>
+        <w:t xml:space="preserve">To Do → In Progress</w:t>
+      </w:r>
+      <w:r>
+        <w:t xml:space="preserve">.</w:t>
+      </w:r>
+    </w:p>
+    <w:p>
+      <w:pPr>
+        <w:numPr>
+          <w:ilvl w:val="0"/>
+          <w:numId w:val="1013"/>
+        </w:numPr>
+        <w:pStyle w:val="Compact"/>
+      </w:pPr>
+      <w:r>
+        <w:t xml:space="preserve">Open a</w:t>
+      </w:r>
+      <w:r>
+        <w:t xml:space="preserve"> </w:t>
+      </w:r>
+      <w:r>
+        <w:rPr>
+          <w:b/>
+        </w:rPr>
+        <w:t xml:space="preserve">Pull Request</w:t>
+      </w:r>
+      <w:r>
+        <w:t xml:space="preserve">: base =</w:t>
+      </w:r>
+      <w:r>
+        <w:t xml:space="preserve"> </w:t>
+      </w:r>
+      <w:r>
+        <w:rPr>
+          <w:rStyle w:val="VerbatimChar"/>
+        </w:rPr>
+        <w:t xml:space="preserve">main</w:t>
+      </w:r>
+      <w:r>
+        <w:t xml:space="preserve">, compare = the feature branch</w:t>
+      </w:r>
+      <w:r>
+        <w:t xml:space="preserve"> </w:t>
+      </w:r>
+      <w:r>
+        <w:t xml:space="preserve">(</w:t>
+      </w:r>
+      <w:r>
+        <w:rPr>
+          <w:rStyle w:val="VerbatimChar"/>
+        </w:rPr>
+        <w:t xml:space="preserve">https://github.com/irasiii/&lt;repo&gt;/pull/new/&lt;branch&gt;</w:t>
+      </w:r>
+      <w:r>
+        <w:t xml:space="preserve">).</w:t>
+      </w:r>
+    </w:p>
+    <w:p>
+      <w:pPr>
+        <w:numPr>
+          <w:ilvl w:val="0"/>
+          <w:numId w:val="1013"/>
+        </w:numPr>
+        <w:pStyle w:val="Compact"/>
+      </w:pPr>
+      <w:r>
+        <w:rPr>
+          <w:b/>
+        </w:rPr>
+        <w:t xml:space="preserve">CI runs</w:t>
+      </w:r>
+      <w:r>
+        <w:t xml:space="preserve"> </w:t>
+      </w:r>
+      <w:r>
+        <w:t xml:space="preserve">(</w:t>
+      </w:r>
+      <w:r>
+        <w:rPr>
+          <w:rStyle w:val="VerbatimChar"/>
+        </w:rPr>
+        <w:t xml:space="preserve">ci.yml</w:t>
+      </w:r>
+      <w:r>
+        <w:t xml:space="preserve"> </w:t>
+      </w:r>
+      <w:r>
+        <w:t xml:space="preserve">→ jobs</w:t>
+      </w:r>
+      <w:r>
+        <w:t xml:space="preserve"> </w:t>
+      </w:r>
+      <w:r>
+        <w:rPr>
+          <w:b/>
+        </w:rPr>
+        <w:t xml:space="preserve">Backend CI</w:t>
+      </w:r>
+      <w:r>
+        <w:t xml:space="preserve"> </w:t>
+      </w:r>
+      <w:r>
+        <w:t xml:space="preserve">+</w:t>
+      </w:r>
+      <w:r>
+        <w:t xml:space="preserve"> </w:t>
+      </w:r>
+      <w:r>
+        <w:rPr>
+          <w:b/>
+        </w:rPr>
+        <w:t xml:space="preserve">Frontend CI</w:t>
+      </w:r>
+      <w:r>
+        <w:t xml:space="preserve">). Wait for green.</w:t>
+      </w:r>
+    </w:p>
+    <w:p>
+      <w:pPr>
+        <w:numPr>
+          <w:ilvl w:val="0"/>
+          <w:numId w:val="1013"/>
+        </w:numPr>
+        <w:pStyle w:val="Compact"/>
+      </w:pPr>
+      <w:r>
+        <w:t xml:space="preserve">Review the diff, then</w:t>
+      </w:r>
+      <w:r>
+        <w:t xml:space="preserve"> </w:t>
+      </w:r>
+      <w:r>
+        <w:rPr>
+          <w:b/>
+        </w:rPr>
+        <w:t xml:space="preserve">Merge pull request</w:t>
+      </w:r>
+      <w:r>
+        <w:t xml:space="preserve">.</w:t>
+      </w:r>
+    </w:p>
+    <w:p>
+      <w:pPr>
+        <w:numPr>
+          <w:ilvl w:val="0"/>
+          <w:numId w:val="1013"/>
+        </w:numPr>
+        <w:pStyle w:val="Compact"/>
+      </w:pPr>
+      <w:r>
+        <w:t xml:space="preserve">Move the Jira task</w:t>
+      </w:r>
+      <w:r>
+        <w:t xml:space="preserve"> </w:t>
+      </w:r>
+      <w:r>
+        <w:rPr>
+          <w:b/>
+        </w:rPr>
+        <w:t xml:space="preserve">→ Done</w:t>
+      </w:r>
+      <w:r>
+        <w:t xml:space="preserve">.</w:t>
+      </w:r>
+    </w:p>
+    <w:p>
+      <w:pPr>
+        <w:pStyle w:val="FirstParagraph"/>
+      </w:pPr>
+      <w:r>
+        <w:t xml:space="preserve">Then promote: open a PR base =</w:t>
+      </w:r>
+      <w:r>
+        <w:t xml:space="preserve"> </w:t>
+      </w:r>
+      <w:r>
+        <w:rPr>
+          <w:rStyle w:val="VerbatimChar"/>
+        </w:rPr>
+        <w:t xml:space="preserve">production</w:t>
+      </w:r>
+      <w:r>
+        <w:t xml:space="preserve">, compare =</w:t>
+      </w:r>
+      <w:r>
+        <w:t xml:space="preserve"> </w:t>
+      </w:r>
+      <w:r>
+        <w:rPr>
+          <w:rStyle w:val="VerbatimChar"/>
+        </w:rPr>
+        <w:t xml:space="preserve">main</w:t>
+      </w:r>
+      <w:r>
+        <w:t xml:space="preserve"> </w:t>
+      </w:r>
+      <w:r>
+        <w:t xml:space="preserve">→</w:t>
+      </w:r>
+      <w:r>
+        <w:t xml:space="preserve"> </w:t>
+      </w:r>
+      <w:r>
+        <w:rPr>
+          <w:rStyle w:val="VerbatimChar"/>
+        </w:rPr>
+        <w:t xml:space="preserve">deploy.yml</w:t>
+      </w:r>
+      <w:r>
+        <w:t xml:space="preserve"> </w:t>
+      </w:r>
+      <w:r>
+        <w:t xml:space="preserve">posts the</w:t>
+      </w:r>
+      <w:r>
+        <w:t xml:space="preserve"> </w:t>
+      </w:r>
+      <w:r>
+        <w:t xml:space="preserve">terraform plan → merge →</w:t>
+      </w:r>
+      <w:r>
+        <w:t xml:space="preserve"> </w:t>
+      </w:r>
+      <w:r>
+        <w:rPr>
+          <w:rStyle w:val="VerbatimChar"/>
+        </w:rPr>
+        <w:t xml:space="preserve">redeploy.yml</w:t>
+      </w:r>
+      <w:r>
+        <w:t xml:space="preserve"> </w:t>
+      </w:r>
+      <w:r>
+        <w:t xml:space="preserve">ships to the App EC2.</w:t>
+      </w:r>
+    </w:p>
+    <w:p>
+      <w:pPr>
+        <w:pStyle w:val="Heading3"/>
+      </w:pPr>
+      <w:bookmarkStart w:id="52" w:name="X0fb14678a075dd082a8e28a234b89cb159a9071"/>
+      <w:r>
+        <w:t xml:space="preserve">Enforce</w:t>
+      </w:r>
+      <w:r>
+        <w:t xml:space="preserve"> </w:t>
+      </w:r>
+      <w:r>
+        <w:t xml:space="preserve">“</w:t>
+      </w:r>
+      <w:r>
+        <w:t xml:space="preserve">no merge without passing tests</w:t>
+      </w:r>
+      <w:r>
+        <w:t xml:space="preserve">”</w:t>
+      </w:r>
+      <w:r>
+        <w:t xml:space="preserve"> </w:t>
+      </w:r>
+      <w:r>
+        <w:t xml:space="preserve">(branch protection) — REQUIRED</w:t>
+      </w:r>
+      <w:bookmarkEnd w:id="52"/>
+    </w:p>
+    <w:p>
+      <w:pPr>
+        <w:pStyle w:val="FirstParagraph"/>
+      </w:pPr>
+      <w:r>
+        <w:t xml:space="preserve">This makes GitHub</w:t>
+      </w:r>
+      <w:r>
+        <w:t xml:space="preserve"> </w:t>
+      </w:r>
+      <w:r>
+        <w:rPr>
+          <w:b/>
+        </w:rPr>
+        <w:t xml:space="preserve">block the Merge button until CI is green</w:t>
+      </w:r>
+      <w:r>
+        <w:t xml:space="preserve">, and re-tests the merge</w:t>
+      </w:r>
+      <w:r>
+        <w:t xml:space="preserve"> </w:t>
+      </w:r>
+      <w:r>
+        <w:t xml:space="preserve">against the latest</w:t>
+      </w:r>
+      <w:r>
+        <w:t xml:space="preserve"> </w:t>
+      </w:r>
+      <w:r>
+        <w:rPr>
+          <w:rStyle w:val="VerbatimChar"/>
+        </w:rPr>
+        <w:t xml:space="preserve">main</w:t>
+      </w:r>
+      <w:r>
+        <w:t xml:space="preserve"> </w:t>
+      </w:r>
+      <w:r>
+        <w:t xml:space="preserve">so a merge can never break</w:t>
+      </w:r>
+      <w:r>
+        <w:t xml:space="preserve"> </w:t>
+      </w:r>
+      <w:r>
+        <w:rPr>
+          <w:rStyle w:val="VerbatimChar"/>
+        </w:rPr>
+        <w:t xml:space="preserve">main</w:t>
+      </w:r>
+      <w:r>
+        <w:t xml:space="preserve">. Set it once per repo:</w:t>
+      </w:r>
+    </w:p>
+    <w:p>
+      <w:pPr>
+        <w:numPr>
+          <w:ilvl w:val="0"/>
+          <w:numId w:val="1014"/>
+        </w:numPr>
+        <w:pStyle w:val="Compact"/>
+      </w:pPr>
+      <w:r>
+        <w:t xml:space="preserve">Open</w:t>
+      </w:r>
+      <w:r>
+        <w:t xml:space="preserve"> </w:t>
+      </w:r>
+      <w:r>
+        <w:rPr>
+          <w:b/>
+        </w:rPr>
+        <w:t xml:space="preserve">one</w:t>
+      </w:r>
+      <w:r>
+        <w:t xml:space="preserve"> </w:t>
+      </w:r>
+      <w:r>
+        <w:t xml:space="preserve">PR first and let</w:t>
+      </w:r>
+      <w:r>
+        <w:t xml:space="preserve"> </w:t>
+      </w:r>
+      <w:r>
+        <w:rPr>
+          <w:rStyle w:val="VerbatimChar"/>
+        </w:rPr>
+        <w:t xml:space="preserve">ci.yml</w:t>
+      </w:r>
+      <w:r>
+        <w:t xml:space="preserve"> </w:t>
+      </w:r>
+      <w:r>
+        <w:t xml:space="preserve">run once — GitHub only lists a check after it has</w:t>
+      </w:r>
+      <w:r>
+        <w:t xml:space="preserve"> </w:t>
+      </w:r>
+      <w:r>
+        <w:t xml:space="preserve">run at least once. (Check names:</w:t>
+      </w:r>
+      <w:r>
+        <w:t xml:space="preserve"> </w:t>
+      </w:r>
+      <w:r>
+        <w:rPr>
+          <w:b/>
+        </w:rPr>
+        <w:t xml:space="preserve">Backend CI</w:t>
+      </w:r>
+      <w:r>
+        <w:t xml:space="preserve">,</w:t>
+      </w:r>
+      <w:r>
+        <w:t xml:space="preserve"> </w:t>
+      </w:r>
+      <w:r>
+        <w:rPr>
+          <w:b/>
+        </w:rPr>
+        <w:t xml:space="preserve">Frontend CI</w:t>
+      </w:r>
+      <w:r>
+        <w:t xml:space="preserve">.)</w:t>
+      </w:r>
+    </w:p>
+    <w:p>
+      <w:pPr>
+        <w:numPr>
+          <w:ilvl w:val="0"/>
+          <w:numId w:val="1014"/>
+        </w:numPr>
+        <w:pStyle w:val="Compact"/>
+      </w:pPr>
+      <w:r>
+        <w:t xml:space="preserve">Repo →</w:t>
+      </w:r>
+      <w:r>
+        <w:t xml:space="preserve"> </w:t>
+      </w:r>
+      <w:r>
+        <w:rPr>
+          <w:b/>
+        </w:rPr>
+        <w:t xml:space="preserve">Settings → Branches → Add branch protection rule</w:t>
+      </w:r>
+      <w:r>
+        <w:t xml:space="preserve"> </w:t>
+      </w:r>
+      <w:r>
+        <w:t xml:space="preserve">(or</w:t>
+      </w:r>
+      <w:r>
+        <w:t xml:space="preserve"> </w:t>
+      </w:r>
+      <w:r>
+        <w:rPr>
+          <w:b/>
+        </w:rPr>
+        <w:t xml:space="preserve">Settings → Rules →</w:t>
+      </w:r>
+      <w:r>
+        <w:rPr>
+          <w:b/>
+        </w:rPr>
+        <w:t xml:space="preserve"> </w:t>
+      </w:r>
+      <w:r>
+        <w:rPr>
+          <w:b/>
+        </w:rPr>
+        <w:t xml:space="preserve">Rulesets → New branch ruleset</w:t>
+      </w:r>
+      <w:r>
+        <w:t xml:space="preserve">).</w:t>
+      </w:r>
+    </w:p>
+    <w:p>
+      <w:pPr>
+        <w:numPr>
+          <w:ilvl w:val="0"/>
+          <w:numId w:val="1014"/>
+        </w:numPr>
+        <w:pStyle w:val="Compact"/>
+      </w:pPr>
+      <w:r>
+        <w:t xml:space="preserve">Branch name pattern:</w:t>
+      </w:r>
+      <w:r>
+        <w:t xml:space="preserve"> </w:t>
+      </w:r>
+      <w:r>
+        <w:rPr>
+          <w:rStyle w:val="VerbatimChar"/>
+        </w:rPr>
+        <w:t xml:space="preserve">main</w:t>
+      </w:r>
+      <w:r>
+        <w:t xml:space="preserve">.</w:t>
+      </w:r>
+    </w:p>
+    <w:p>
+      <w:pPr>
+        <w:numPr>
+          <w:ilvl w:val="0"/>
+          <w:numId w:val="1014"/>
+        </w:numPr>
+        <w:pStyle w:val="Compact"/>
+      </w:pPr>
+      <w:r>
+        <w:t xml:space="preserve">Tick:</w:t>
+      </w:r>
+    </w:p>
+    <w:p>
+      <w:pPr>
+        <w:numPr>
+          <w:ilvl w:val="1"/>
+          <w:numId w:val="1015"/>
+        </w:numPr>
+        <w:pStyle w:val="Compact"/>
+      </w:pPr>
+      <w:r>
+        <w:t xml:space="preserve">☑</w:t>
+      </w:r>
+      <w:r>
+        <w:t xml:space="preserve"> </w:t>
+      </w:r>
+      <w:r>
+        <w:rPr>
+          <w:b/>
+        </w:rPr>
+        <w:t xml:space="preserve">Require a pull request before merging</w:t>
+      </w:r>
+      <w:r>
+        <w:t xml:space="preserve"> </w:t>
+      </w:r>
+      <w:r>
+        <w:t xml:space="preserve">(blocks direct pushes to</w:t>
+      </w:r>
+      <w:r>
+        <w:t xml:space="preserve"> </w:t>
+      </w:r>
+      <w:r>
+        <w:rPr>
+          <w:rStyle w:val="VerbatimChar"/>
+        </w:rPr>
+        <w:t xml:space="preserve">main</w:t>
+      </w:r>
+      <w:r>
+        <w:t xml:space="preserve">).</w:t>
+      </w:r>
+    </w:p>
+    <w:p>
+      <w:pPr>
+        <w:numPr>
+          <w:ilvl w:val="1"/>
+          <w:numId w:val="1015"/>
+        </w:numPr>
+        <w:pStyle w:val="Compact"/>
+      </w:pPr>
+      <w:r>
+        <w:t xml:space="preserve">☑</w:t>
+      </w:r>
+      <w:r>
+        <w:t xml:space="preserve"> </w:t>
+      </w:r>
+      <w:r>
+        <w:rPr>
+          <w:b/>
+        </w:rPr>
+        <w:t xml:space="preserve">Require status checks to pass before merging</w:t>
+      </w:r>
+      <w:r>
+        <w:t xml:space="preserve"> </w:t>
+      </w:r>
+      <w:r>
+        <w:t xml:space="preserve">→ select</w:t>
+      </w:r>
+      <w:r>
+        <w:t xml:space="preserve"> </w:t>
+      </w:r>
+      <w:r>
+        <w:rPr>
+          <w:b/>
+        </w:rPr>
+        <w:t xml:space="preserve">Backend CI</w:t>
+      </w:r>
+      <w:r>
+        <w:t xml:space="preserve"> </w:t>
+      </w:r>
+      <w:r>
+        <w:t xml:space="preserve">and</w:t>
+      </w:r>
+      <w:r>
+        <w:t xml:space="preserve"> </w:t>
+      </w:r>
+      <w:r>
+        <w:rPr>
+          <w:b/>
+        </w:rPr>
+        <w:t xml:space="preserve">Frontend CI</w:t>
+      </w:r>
+      <w:r>
+        <w:t xml:space="preserve">.</w:t>
+      </w:r>
+    </w:p>
+    <w:p>
+      <w:pPr>
+        <w:numPr>
+          <w:ilvl w:val="1"/>
+          <w:numId w:val="1015"/>
+        </w:numPr>
+        <w:pStyle w:val="Compact"/>
+      </w:pPr>
+      <w:r>
+        <w:t xml:space="preserve">☑</w:t>
+      </w:r>
+      <w:r>
+        <w:t xml:space="preserve"> </w:t>
+      </w:r>
+      <w:r>
+        <w:rPr>
+          <w:b/>
+        </w:rPr>
+        <w:t xml:space="preserve">Require branches to be up to date before merging</w:t>
+      </w:r>
+      <w:r>
+        <w:t xml:space="preserve"> </w:t>
+      </w:r>
+      <w:r>
+        <w:t xml:space="preserve">← re-runs CI on the merge</w:t>
+      </w:r>
+      <w:r>
+        <w:t xml:space="preserve"> </w:t>
+      </w:r>
+      <w:r>
+        <w:t xml:space="preserve">result, so</w:t>
+      </w:r>
+      <w:r>
+        <w:t xml:space="preserve"> </w:t>
+      </w:r>
+      <w:r>
+        <w:rPr>
+          <w:rStyle w:val="VerbatimChar"/>
+        </w:rPr>
+        <w:t xml:space="preserve">main</w:t>
+      </w:r>
+      <w:r>
+        <w:t xml:space="preserve"> </w:t>
+      </w:r>
+      <w:r>
+        <w:t xml:space="preserve">can’t be broken by a stale branch.</w:t>
+      </w:r>
+    </w:p>
+    <w:p>
+      <w:pPr>
+        <w:numPr>
+          <w:ilvl w:val="1"/>
+          <w:numId w:val="1015"/>
+        </w:numPr>
+        <w:pStyle w:val="Compact"/>
+      </w:pPr>
+      <w:r>
+        <w:t xml:space="preserve">☑ (optional)</w:t>
+      </w:r>
+      <w:r>
+        <w:t xml:space="preserve"> </w:t>
+      </w:r>
+      <w:r>
+        <w:rPr>
+          <w:b/>
+        </w:rPr>
+        <w:t xml:space="preserve">Do not allow bypassing the above settings</w:t>
+      </w:r>
+      <w:r>
+        <w:t xml:space="preserve"> </w:t>
+      </w:r>
+      <w:r>
+        <w:t xml:space="preserve">(include admins).</w:t>
+      </w:r>
+    </w:p>
+    <w:p>
+      <w:pPr>
+        <w:numPr>
+          <w:ilvl w:val="0"/>
+          <w:numId w:val="1014"/>
+        </w:numPr>
+        <w:pStyle w:val="Compact"/>
+      </w:pPr>
+      <w:r>
+        <w:rPr>
+          <w:b/>
+        </w:rPr>
+        <w:t xml:space="preserve">Save.</w:t>
+      </w:r>
+      <w:r>
+        <w:t xml:space="preserve"> </w:t>
+      </w:r>
+      <w:r>
+        <w:t xml:space="preserve">Repeat with pattern</w:t>
+      </w:r>
+      <w:r>
+        <w:t xml:space="preserve"> </w:t>
+      </w:r>
+      <w:r>
+        <w:rPr>
+          <w:rStyle w:val="VerbatimChar"/>
+        </w:rPr>
+        <w:t xml:space="preserve">production</w:t>
+      </w:r>
+      <w:r>
+        <w:t xml:space="preserve"> </w:t>
+      </w:r>
+      <w:r>
+        <w:t xml:space="preserve">to gate deploys.</w:t>
+      </w:r>
+    </w:p>
+    <w:p>
+      <w:pPr>
+        <w:pStyle w:val="BlockText"/>
+      </w:pPr>
+      <w:r>
+        <w:rPr>
+          <w:b/>
+        </w:rPr>
+        <w:t xml:space="preserve">Why the assistant can’t toggle this:</w:t>
+      </w:r>
+      <w:r>
+        <w:t xml:space="preserve"> </w:t>
+      </w:r>
+      <w:r>
+        <w:t xml:space="preserve">branch-protection, PR create/merge, and</w:t>
+      </w:r>
+      <w:r>
+        <w:t xml:space="preserve"> </w:t>
+      </w:r>
+      <w:r>
+        <w:rPr>
+          <w:rStyle w:val="VerbatimChar"/>
+        </w:rPr>
+        <w:t xml:space="preserve">workflow_dispatch</w:t>
+      </w:r>
+      <w:r>
+        <w:t xml:space="preserve"> </w:t>
+      </w:r>
+      <w:r>
+        <w:t xml:space="preserve">all go through</w:t>
+      </w:r>
+      <w:r>
+        <w:t xml:space="preserve"> </w:t>
+      </w:r>
+      <w:r>
+        <w:rPr>
+          <w:rStyle w:val="VerbatimChar"/>
+        </w:rPr>
+        <w:t xml:space="preserve">api.github.com</w:t>
+      </w:r>
+      <w:r>
+        <w:t xml:space="preserve">, which is blocked from the sandbox.</w:t>
+      </w:r>
+      <w:r>
+        <w:t xml:space="preserve"> </w:t>
+      </w:r>
+      <w:r>
+        <w:t xml:space="preserve">Branch pushes work; protection + PR + merge + CI are your clicks in the UI.</w:t>
+      </w:r>
+    </w:p>
+    <w:p>
+      <w:r>
+        <w:pict>
+          <v:rect style="width:0;height:1.5pt" o:hralign="center" o:hrstd="t" o:hr="t"/>
+        </w:pict>
+      </w:r>
+    </w:p>
+    <w:p>
+      <w:pPr>
+        <w:pStyle w:val="Heading2"/>
+      </w:pPr>
+      <w:bookmarkStart w:id="53" w:name="cheat-sheet"/>
+      <w:r>
+        <w:t xml:space="preserve">15. Cheat sheet</w:t>
+      </w:r>
+      <w:bookmarkEnd w:id="53"/>
+    </w:p>
+    <w:p>
+      <w:pPr>
+        <w:pStyle w:val="SourceCode"/>
+      </w:pPr>
+      <w:r>
+        <w:rPr>
+          <w:rStyle w:val="CommentTok"/>
+        </w:rPr>
+        <w:t xml:space="preserve"># run locally</w:t>
+      </w:r>
+      <w:r>
+        <w:br/>
+      </w:r>
+      <w:r>
+        <w:rPr>
+          <w:rStyle w:val="BuiltInTok"/>
+        </w:rPr>
+        <w:t xml:space="preserve">cd</w:t>
+      </w:r>
+      <w:r>
+        <w:rPr>
+          <w:rStyle w:val="NormalTok"/>
+        </w:rPr>
+        <w:t xml:space="preserve"> backend </w:t>
+      </w:r>
+      <w:r>
+        <w:rPr>
+          <w:rStyle w:val="KeywordTok"/>
+        </w:rPr>
+        <w:t xml:space="preserve">&amp;&amp;</w:t>
+      </w:r>
+      <w:r>
+        <w:rPr>
+          <w:rStyle w:val="NormalTok"/>
+        </w:rPr>
+        <w:t xml:space="preserve"> </w:t>
+      </w:r>
+      <w:r>
+        <w:rPr>
+          <w:rStyle w:val="ExtensionTok"/>
+        </w:rPr>
+        <w:t xml:space="preserve">npm</w:t>
+      </w:r>
+      <w:r>
+        <w:rPr>
+          <w:rStyle w:val="NormalTok"/>
+        </w:rPr>
+        <w:t xml:space="preserve"> run dev</w:t>
+      </w:r>
+      <w:r>
+        <w:br/>
+      </w:r>
+      <w:r>
+        <w:rPr>
+          <w:rStyle w:val="BuiltInTok"/>
+        </w:rPr>
+        <w:t xml:space="preserve">cd</w:t>
+      </w:r>
+      <w:r>
+        <w:rPr>
+          <w:rStyle w:val="NormalTok"/>
+        </w:rPr>
+        <w:t xml:space="preserve"> frontend </w:t>
+      </w:r>
+      <w:r>
+        <w:rPr>
+          <w:rStyle w:val="KeywordTok"/>
+        </w:rPr>
+        <w:t xml:space="preserve">&amp;&amp;</w:t>
+      </w:r>
+      <w:r>
+        <w:rPr>
+          <w:rStyle w:val="NormalTok"/>
+        </w:rPr>
+        <w:t xml:space="preserve"> </w:t>
+      </w:r>
+      <w:r>
+        <w:rPr>
+          <w:rStyle w:val="ExtensionTok"/>
+        </w:rPr>
+        <w:t xml:space="preserve">npm</w:t>
+      </w:r>
+      <w:r>
+        <w:rPr>
+          <w:rStyle w:val="NormalTok"/>
+        </w:rPr>
+        <w:t xml:space="preserve"> run dev</w:t>
+      </w:r>
+      <w:r>
+        <w:br/>
+      </w:r>
+      <w:r>
+        <w:rPr>
+          <w:rStyle w:val="ExtensionTok"/>
+        </w:rPr>
+        <w:t xml:space="preserve">npm</w:t>
+      </w:r>
+      <w:r>
+        <w:rPr>
+          <w:rStyle w:val="NormalTok"/>
+        </w:rPr>
+        <w:t xml:space="preserve"> run seed                      # reseed DB</w:t>
+      </w:r>
+      <w:r>
+        <w:br/>
+      </w:r>
+      <w:r>
+        <w:br/>
+      </w:r>
+      <w:r>
+        <w:rPr>
+          <w:rStyle w:val="CommentTok"/>
+        </w:rPr>
+        <w:t xml:space="preserve"># tests</w:t>
+      </w:r>
+      <w:r>
+        <w:br/>
+      </w:r>
+      <w:r>
+        <w:rPr>
+          <w:rStyle w:val="BuiltInTok"/>
+        </w:rPr>
+        <w:t xml:space="preserve">cd</w:t>
+      </w:r>
+      <w:r>
+        <w:rPr>
+          <w:rStyle w:val="NormalTok"/>
+        </w:rPr>
+        <w:t xml:space="preserve"> backend </w:t>
+      </w:r>
+      <w:r>
+        <w:rPr>
+          <w:rStyle w:val="KeywordTok"/>
+        </w:rPr>
+        <w:t xml:space="preserve">&amp;&amp;</w:t>
+      </w:r>
+      <w:r>
+        <w:rPr>
+          <w:rStyle w:val="NormalTok"/>
+        </w:rPr>
+        <w:t xml:space="preserve"> </w:t>
+      </w:r>
+      <w:r>
+        <w:rPr>
+          <w:rStyle w:val="ExtensionTok"/>
+        </w:rPr>
+        <w:t xml:space="preserve">npm</w:t>
+      </w:r>
+      <w:r>
+        <w:rPr>
+          <w:rStyle w:val="NormalTok"/>
+        </w:rPr>
+        <w:t xml:space="preserve"> test            # 40 passing</w:t>
+      </w:r>
+      <w:r>
+        <w:br/>
+      </w:r>
+      <w:r>
+        <w:rPr>
+          <w:rStyle w:val="ExtensionTok"/>
+        </w:rPr>
+        <w:t xml:space="preserve">npx</w:t>
+      </w:r>
+      <w:r>
+        <w:rPr>
+          <w:rStyle w:val="NormalTok"/>
+        </w:rPr>
+        <w:t xml:space="preserve"> mocha --grep </w:t>
+      </w:r>
+      <w:r>
+        <w:rPr>
+          <w:rStyle w:val="StringTok"/>
+        </w:rPr>
+        <w:t xml:space="preserve">"Strategy"</w:t>
+      </w:r>
+      <w:r>
+        <w:br/>
+      </w:r>
+      <w:r>
+        <w:br/>
+      </w:r>
+      <w:r>
+        <w:rPr>
+          <w:rStyle w:val="CommentTok"/>
+        </w:rPr>
+        <w:t xml:space="preserve"># git: new task branch</w:t>
+      </w:r>
+      <w:r>
+        <w:br/>
+      </w:r>
+      <w:r>
+        <w:rPr>
+          <w:rStyle w:val="FunctionTok"/>
+        </w:rPr>
+        <w:t xml:space="preserve">git</w:t>
+      </w:r>
+      <w:r>
+        <w:rPr>
+          <w:rStyle w:val="NormalTok"/>
+        </w:rPr>
+        <w:t xml:space="preserve"> checkout main </w:t>
+      </w:r>
+      <w:r>
+        <w:rPr>
+          <w:rStyle w:val="KeywordTok"/>
+        </w:rPr>
+        <w:t xml:space="preserve">&amp;&amp;</w:t>
+      </w:r>
+      <w:r>
+        <w:rPr>
+          <w:rStyle w:val="NormalTok"/>
+        </w:rPr>
+        <w:t xml:space="preserve"> </w:t>
+      </w:r>
+      <w:r>
+        <w:rPr>
+          <w:rStyle w:val="FunctionTok"/>
+        </w:rPr>
+        <w:t xml:space="preserve">git</w:t>
+      </w:r>
+      <w:r>
+        <w:rPr>
+          <w:rStyle w:val="NormalTok"/>
+        </w:rPr>
+        <w:t xml:space="preserve"> checkout -b feature/</w:t>
+      </w:r>
+      <w:r>
+        <w:rPr>
+          <w:rStyle w:val="OperatorTok"/>
+        </w:rPr>
+        <w:t xml:space="preserve">&lt;</w:t>
+      </w:r>
+      <w:r>
+        <w:rPr>
+          <w:rStyle w:val="NormalTok"/>
+        </w:rPr>
+        <w:t xml:space="preserve">name</w:t>
+      </w:r>
+      <w:r>
+        <w:rPr>
+          <w:rStyle w:val="OperatorTok"/>
+        </w:rPr>
+        <w:t xml:space="preserve">&gt;</w:t>
+      </w:r>
+      <w:r>
+        <w:br/>
+      </w:r>
+      <w:r>
+        <w:rPr>
+          <w:rStyle w:val="FunctionTok"/>
+        </w:rPr>
+        <w:t xml:space="preserve">git</w:t>
+      </w:r>
+      <w:r>
+        <w:rPr>
+          <w:rStyle w:val="NormalTok"/>
+        </w:rPr>
+        <w:t xml:space="preserve"> add </w:t>
+      </w:r>
+      <w:r>
+        <w:rPr>
+          <w:rStyle w:val="OperatorTok"/>
+        </w:rPr>
+        <w:t xml:space="preserve">&lt;</w:t>
+      </w:r>
+      <w:r>
+        <w:rPr>
+          <w:rStyle w:val="NormalTok"/>
+        </w:rPr>
+        <w:t xml:space="preserve">files</w:t>
+      </w:r>
+      <w:r>
+        <w:rPr>
+          <w:rStyle w:val="OperatorTok"/>
+        </w:rPr>
+        <w:t xml:space="preserve">&gt;</w:t>
+      </w:r>
+      <w:r>
+        <w:rPr>
+          <w:rStyle w:val="NormalTok"/>
+        </w:rPr>
+        <w:t xml:space="preserve"> </w:t>
+      </w:r>
+      <w:r>
+        <w:rPr>
+          <w:rStyle w:val="KeywordTok"/>
+        </w:rPr>
+        <w:t xml:space="preserve">&amp;&amp;</w:t>
+      </w:r>
+      <w:r>
+        <w:rPr>
+          <w:rStyle w:val="NormalTok"/>
+        </w:rPr>
+        <w:t xml:space="preserve"> </w:t>
+      </w:r>
+      <w:r>
+        <w:rPr>
+          <w:rStyle w:val="FunctionTok"/>
+        </w:rPr>
+        <w:t xml:space="preserve">git</w:t>
+      </w:r>
+      <w:r>
+        <w:rPr>
+          <w:rStyle w:val="NormalTok"/>
+        </w:rPr>
+        <w:t xml:space="preserve"> commit -m </w:t>
+      </w:r>
+      <w:r>
+        <w:rPr>
+          <w:rStyle w:val="StringTok"/>
+        </w:rPr>
+        <w:t xml:space="preserve">"feat: ..."</w:t>
+      </w:r>
+      <w:r>
+        <w:br/>
+      </w:r>
+      <w:r>
+        <w:rPr>
+          <w:rStyle w:val="FunctionTok"/>
+        </w:rPr>
+        <w:t xml:space="preserve">git</w:t>
+      </w:r>
+      <w:r>
+        <w:rPr>
+          <w:rStyle w:val="NormalTok"/>
+        </w:rPr>
+        <w:t xml:space="preserve"> push -u origin feature/</w:t>
+      </w:r>
+      <w:r>
+        <w:rPr>
+          <w:rStyle w:val="OperatorTok"/>
+        </w:rPr>
+        <w:t xml:space="preserve">&lt;</w:t>
+      </w:r>
+      <w:r>
+        <w:rPr>
+          <w:rStyle w:val="NormalTok"/>
+        </w:rPr>
+        <w:t xml:space="preserve">name</w:t>
+      </w:r>
+      <w:r>
+        <w:rPr>
+          <w:rStyle w:val="OperatorTok"/>
+        </w:rPr>
+        <w:t xml:space="preserve">&gt;</w:t>
+      </w:r>
+      <w:r>
+        <w:br/>
+      </w:r>
+      <w:r>
+        <w:br/>
+      </w:r>
+      <w:r>
+        <w:rPr>
+          <w:rStyle w:val="CommentTok"/>
+        </w:rPr>
+        <w:t xml:space="preserve"># PR + merge (gh CLI, if api reachable)</w:t>
+      </w:r>
+      <w:r>
+        <w:br/>
+      </w:r>
+      <w:r>
+        <w:rPr>
+          <w:rStyle w:val="ExtensionTok"/>
+        </w:rPr>
+        <w:t xml:space="preserve">gh</w:t>
+      </w:r>
+      <w:r>
+        <w:rPr>
+          <w:rStyle w:val="NormalTok"/>
+        </w:rPr>
+        <w:t xml:space="preserve"> pr create --base main --head feature/</w:t>
+      </w:r>
+      <w:r>
+        <w:rPr>
+          <w:rStyle w:val="OperatorTok"/>
+        </w:rPr>
+        <w:t xml:space="preserve">&lt;</w:t>
+      </w:r>
+      <w:r>
+        <w:rPr>
+          <w:rStyle w:val="NormalTok"/>
+        </w:rPr>
+        <w:t xml:space="preserve">name</w:t>
+      </w:r>
+      <w:r>
+        <w:rPr>
+          <w:rStyle w:val="OperatorTok"/>
+        </w:rPr>
+        <w:t xml:space="preserve">&gt;</w:t>
+      </w:r>
+      <w:r>
+        <w:rPr>
+          <w:rStyle w:val="NormalTok"/>
+        </w:rPr>
+        <w:t xml:space="preserve"> --fill</w:t>
+      </w:r>
+      <w:r>
+        <w:br/>
+      </w:r>
+      <w:r>
+        <w:rPr>
+          <w:rStyle w:val="ExtensionTok"/>
+        </w:rPr>
+        <w:t xml:space="preserve">gh</w:t>
+      </w:r>
+      <w:r>
+        <w:rPr>
+          <w:rStyle w:val="NormalTok"/>
+        </w:rPr>
+        <w:t xml:space="preserve"> pr merge feature/</w:t>
+      </w:r>
+      <w:r>
+        <w:rPr>
+          <w:rStyle w:val="OperatorTok"/>
+        </w:rPr>
+        <w:t xml:space="preserve">&lt;</w:t>
+      </w:r>
+      <w:r>
+        <w:rPr>
+          <w:rStyle w:val="NormalTok"/>
+        </w:rPr>
+        <w:t xml:space="preserve">name</w:t>
+      </w:r>
+      <w:r>
+        <w:rPr>
+          <w:rStyle w:val="OperatorTok"/>
+        </w:rPr>
+        <w:t xml:space="preserve">&gt;</w:t>
+      </w:r>
+      <w:r>
+        <w:rPr>
+          <w:rStyle w:val="NormalTok"/>
+        </w:rPr>
+        <w:t xml:space="preserve"> --merge --delete-branch</w:t>
+      </w:r>
+      <w:r>
+        <w:br/>
+      </w:r>
+      <w:r>
+        <w:br/>
+      </w:r>
+      <w:r>
+        <w:rPr>
+          <w:rStyle w:val="CommentTok"/>
+        </w:rPr>
+        <w:t xml:space="preserve"># promote to production (deploys)</w:t>
+      </w:r>
+      <w:r>
+        <w:br/>
+      </w:r>
+      <w:r>
+        <w:rPr>
+          <w:rStyle w:val="ExtensionTok"/>
+        </w:rPr>
+        <w:t xml:space="preserve">gh</w:t>
+      </w:r>
+      <w:r>
+        <w:rPr>
+          <w:rStyle w:val="NormalTok"/>
+        </w:rPr>
+        <w:t xml:space="preserve"> pr create --base production --head main --fill</w:t>
+      </w:r>
+      <w:r>
+        <w:br/>
+      </w:r>
+      <w:r>
+        <w:rPr>
+          <w:rStyle w:val="ExtensionTok"/>
+        </w:rPr>
+        <w:t xml:space="preserve">gh</w:t>
+      </w:r>
+      <w:r>
+        <w:rPr>
+          <w:rStyle w:val="NormalTok"/>
+        </w:rPr>
+        <w:t xml:space="preserve"> pr merge --merge</w:t>
+      </w:r>
+      <w:r>
+        <w:br/>
+      </w:r>
+      <w:r>
+        <w:br/>
+      </w:r>
+      <w:r>
+        <w:rPr>
+          <w:rStyle w:val="CommentTok"/>
+        </w:rPr>
+        <w:t xml:space="preserve"># AWS via Terraform (local)</w:t>
+      </w:r>
+      <w:r>
+        <w:br/>
+      </w:r>
+      <w:r>
+        <w:rPr>
+          <w:rStyle w:val="BuiltInTok"/>
+        </w:rPr>
+        <w:t xml:space="preserve">cd</w:t>
+      </w:r>
+      <w:r>
+        <w:rPr>
+          <w:rStyle w:val="NormalTok"/>
+        </w:rPr>
+        <w:t xml:space="preserve"> terraform </w:t>
+      </w:r>
+      <w:r>
+        <w:rPr>
+          <w:rStyle w:val="KeywordTok"/>
+        </w:rPr>
+        <w:t xml:space="preserve">&amp;&amp;</w:t>
+      </w:r>
+      <w:r>
+        <w:rPr>
+          <w:rStyle w:val="NormalTok"/>
+        </w:rPr>
+        <w:t xml:space="preserve"> </w:t>
+      </w:r>
+      <w:r>
+        <w:rPr>
+          <w:rStyle w:val="ExtensionTok"/>
+        </w:rPr>
+        <w:t xml:space="preserve">terraform</w:t>
+      </w:r>
+      <w:r>
+        <w:rPr>
+          <w:rStyle w:val="NormalTok"/>
+        </w:rPr>
+        <w:t xml:space="preserve"> init </w:t>
+      </w:r>
+      <w:r>
+        <w:rPr>
+          <w:rStyle w:val="KeywordTok"/>
+        </w:rPr>
+        <w:t xml:space="preserve">&amp;&amp;</w:t>
+      </w:r>
+      <w:r>
+        <w:rPr>
+          <w:rStyle w:val="NormalTok"/>
+        </w:rPr>
+        <w:t xml:space="preserve"> </w:t>
+      </w:r>
+      <w:r>
+        <w:rPr>
+          <w:rStyle w:val="ExtensionTok"/>
+        </w:rPr>
+        <w:t xml:space="preserve">terraform</w:t>
+      </w:r>
+      <w:r>
+        <w:rPr>
+          <w:rStyle w:val="NormalTok"/>
+        </w:rPr>
+        <w:t xml:space="preserve"> plan </w:t>
+      </w:r>
+      <w:r>
+        <w:rPr>
+          <w:rStyle w:val="KeywordTok"/>
+        </w:rPr>
+        <w:t xml:space="preserve">&amp;&amp;</w:t>
+      </w:r>
+      <w:r>
+        <w:rPr>
+          <w:rStyle w:val="NormalTok"/>
+        </w:rPr>
+        <w:t xml:space="preserve"> </w:t>
+      </w:r>
+      <w:r>
+        <w:rPr>
+          <w:rStyle w:val="ExtensionTok"/>
+        </w:rPr>
+        <w:t xml:space="preserve">terraform</w:t>
+      </w:r>
+      <w:r>
+        <w:rPr>
+          <w:rStyle w:val="NormalTok"/>
+        </w:rPr>
+        <w:t xml:space="preserve"> apply</w:t>
+      </w:r>
+      <w:r>
+        <w:br/>
+      </w:r>
+      <w:r>
+        <w:rPr>
+          <w:rStyle w:val="ExtensionTok"/>
+        </w:rPr>
+        <w:t xml:space="preserve">terraform</w:t>
+      </w:r>
+      <w:r>
+        <w:rPr>
+          <w:rStyle w:val="NormalTok"/>
+        </w:rPr>
+        <w:t xml:space="preserve"> output summary</w:t>
+      </w:r>
+      <w:r>
+        <w:br/>
+      </w:r>
+      <w:r>
+        <w:rPr>
+          <w:rStyle w:val="ExtensionTok"/>
+        </w:rPr>
+        <w:t xml:space="preserve">terraform</w:t>
+      </w:r>
+      <w:r>
+        <w:rPr>
+          <w:rStyle w:val="NormalTok"/>
+        </w:rPr>
+        <w:t xml:space="preserve"> destroy                 # when done</w:t>
+      </w:r>
+    </w:p>
+    <w:p>
+      <w:r>
+        <w:pict>
+          <v:rect style="width:0;height:1.5pt" o:hralign="center" o:hrstd="t" o:hr="t"/>
+        </w:pict>
+      </w:r>
+    </w:p>
+    <w:p>
+      <w:pPr>
+        <w:pStyle w:val="FirstParagraph"/>
+      </w:pPr>
+      <w:r>
+        <w:rPr>
+          <w:i/>
+        </w:rPr>
+        <w:t xml:space="preserve">Personal runbook — keep in the repo root so the whole team follows the same steps.</w:t>
+      </w:r>
+    </w:p>
+    <w:p>
+      <w:pPr>
+        <w:pStyle w:val="BodyText"/>
+      </w:pPr>
+      <w:r>
+        <w:rPr>
+          <w:i/>
+        </w:rPr>
+        <w:t xml:space="preserve">Last updated: 2026-06-21 — stacked the 3 code branches on event-ticket_2; verified CI</w:t>
+      </w:r>
+      <w:r>
+        <w:rPr>
+          <w:i/>
+        </w:rPr>
+        <w:t xml:space="preserve"> </w:t>
+      </w:r>
+      <w:r>
+        <w:rPr>
+          <w:i/>
+        </w:rPr>
+        <w:t xml:space="preserve">(40 passing, build ok, integrated merge clean); added branch-protection setup (§14).</w:t>
+      </w:r>
+    </w:p>
     <w:sectPr/>
   </w:body>
 </w:document>
@@ -5769,6 +8025,69 @@
     <w:abstractNumId w:val="991"/>
   </w:num>
   <w:num w:numId="1012">
+    <w:abstractNumId w:val="991"/>
+  </w:num>
+  <w:num w:numId="1013">
+    <w:abstractNumId w:val="99411"/>
+    <w:lvlOverride w:ilvl="0">
+      <w:startOverride w:val="1"/>
+    </w:lvlOverride>
+    <w:lvlOverride w:ilvl="1">
+      <w:startOverride w:val="1"/>
+    </w:lvlOverride>
+    <w:lvlOverride w:ilvl="2">
+      <w:startOverride w:val="1"/>
+    </w:lvlOverride>
+    <w:lvlOverride w:ilvl="3">
+      <w:startOverride w:val="1"/>
+    </w:lvlOverride>
+    <w:lvlOverride w:ilvl="4">
+      <w:startOverride w:val="1"/>
+    </w:lvlOverride>
+    <w:lvlOverride w:ilvl="5">
+      <w:startOverride w:val="1"/>
+    </w:lvlOverride>
+    <w:lvlOverride w:ilvl="6">
+      <w:startOverride w:val="1"/>
+    </w:lvlOverride>
+    <w:lvlOverride w:ilvl="7">
+      <w:startOverride w:val="1"/>
+    </w:lvlOverride>
+    <w:lvlOverride w:ilvl="8">
+      <w:startOverride w:val="1"/>
+    </w:lvlOverride>
+  </w:num>
+  <w:num w:numId="1014">
+    <w:abstractNumId w:val="99411"/>
+    <w:lvlOverride w:ilvl="0">
+      <w:startOverride w:val="1"/>
+    </w:lvlOverride>
+    <w:lvlOverride w:ilvl="1">
+      <w:startOverride w:val="1"/>
+    </w:lvlOverride>
+    <w:lvlOverride w:ilvl="2">
+      <w:startOverride w:val="1"/>
+    </w:lvlOverride>
+    <w:lvlOverride w:ilvl="3">
+      <w:startOverride w:val="1"/>
+    </w:lvlOverride>
+    <w:lvlOverride w:ilvl="4">
+      <w:startOverride w:val="1"/>
+    </w:lvlOverride>
+    <w:lvlOverride w:ilvl="5">
+      <w:startOverride w:val="1"/>
+    </w:lvlOverride>
+    <w:lvlOverride w:ilvl="6">
+      <w:startOverride w:val="1"/>
+    </w:lvlOverride>
+    <w:lvlOverride w:ilvl="7">
+      <w:startOverride w:val="1"/>
+    </w:lvlOverride>
+    <w:lvlOverride w:ilvl="8">
+      <w:startOverride w:val="1"/>
+    </w:lvlOverride>
+  </w:num>
+  <w:num w:numId="1015">
     <w:abstractNumId w:val="991"/>
   </w:num>
 </w:numbering>

</xml_diff>

<commit_message>
docs: playbook §16 real API testing (Newman) + §17 from-scratch deploy & gotchas table
</commit_message>
<xml_diff>
--- a/TicketHub_Project_Playbook.docx
+++ b/TicketHub_Project_Playbook.docx
@@ -7472,13 +7472,1832 @@
       </w:r>
     </w:p>
     <w:p>
+      <w:r>
+        <w:pict>
+          <v:rect style="width:0;height:1.5pt" o:hralign="center" o:hrstd="t" o:hr="t"/>
+        </w:pict>
+      </w:r>
+    </w:p>
+    <w:p>
+      <w:pPr>
+        <w:pStyle w:val="Heading2"/>
+      </w:pPr>
+      <w:bookmarkStart w:id="54" w:name="Xa0edd80d8f5e37763429c320db8196e745b1970"/>
+      <w:r>
+        <w:t xml:space="preserve">16. Real API testing on the deployed stack (Newman)</w:t>
+      </w:r>
+      <w:bookmarkEnd w:id="54"/>
+    </w:p>
+    <w:p>
       <w:pPr>
         <w:pStyle w:val="FirstParagraph"/>
       </w:pPr>
       <w:r>
+        <w:t xml:space="preserve">Postman is a desktop GUI — it won’t run on a headless EC2.</w:t>
+      </w:r>
+      <w:r>
+        <w:t xml:space="preserve"> </w:t>
+      </w:r>
+      <w:r>
+        <w:rPr>
+          <w:b/>
+        </w:rPr>
+        <w:t xml:space="preserve">Newman</w:t>
+      </w:r>
+      <w:r>
+        <w:t xml:space="preserve"> </w:t>
+      </w:r>
+      <w:r>
+        <w:t xml:space="preserve">is Postman’s CLI and</w:t>
+      </w:r>
+      <w:r>
+        <w:t xml:space="preserve"> </w:t>
+      </w:r>
+      <w:r>
+        <w:t xml:space="preserve">runs the</w:t>
+      </w:r>
+      <w:r>
+        <w:t xml:space="preserve"> </w:t>
+      </w:r>
+      <w:r>
         <w:rPr>
           <w:i/>
         </w:rPr>
+        <w:t xml:space="preserve">same</w:t>
+      </w:r>
+      <w:r>
+        <w:t xml:space="preserve"> </w:t>
+      </w:r>
+      <w:r>
+        <w:t xml:space="preserve">exported collection. It’s wired up two ways:</w:t>
+      </w:r>
+    </w:p>
+    <w:p>
+      <w:pPr>
+        <w:numPr>
+          <w:ilvl w:val="0"/>
+          <w:numId w:val="1016"/>
+        </w:numPr>
+      </w:pPr>
+      <w:r>
+        <w:rPr>
+          <w:b/>
+        </w:rPr>
+        <w:t xml:space="preserve">Automatic at boot</w:t>
+      </w:r>
+      <w:r>
+        <w:t xml:space="preserve"> </w:t>
+      </w:r>
+      <w:r>
+        <w:t xml:space="preserve">—</w:t>
+      </w:r>
+      <w:r>
+        <w:t xml:space="preserve"> </w:t>
+      </w:r>
+      <w:r>
+        <w:rPr>
+          <w:rStyle w:val="VerbatimChar"/>
+        </w:rPr>
+        <w:t xml:space="preserve">terraform/user_data/app.sh</w:t>
+      </w:r>
+      <w:r>
+        <w:t xml:space="preserve"> </w:t>
+      </w:r>
+      <w:r>
+        <w:t xml:space="preserve">installs Newman and runs an initial</w:t>
+      </w:r>
+      <w:r>
+        <w:t xml:space="preserve"> </w:t>
+      </w:r>
+      <w:r>
+        <w:t xml:space="preserve">test after the API starts, writing</w:t>
+      </w:r>
+      <w:r>
+        <w:t xml:space="preserve"> </w:t>
+      </w:r>
+      <w:r>
+        <w:rPr>
+          <w:rStyle w:val="VerbatimChar"/>
+        </w:rPr>
+        <w:t xml:space="preserve">~/app/newman-report.html</w:t>
+      </w:r>
+      <w:r>
+        <w:t xml:space="preserve">.</w:t>
+      </w:r>
+    </w:p>
+    <w:p>
+      <w:pPr>
+        <w:numPr>
+          <w:ilvl w:val="0"/>
+          <w:numId w:val="1016"/>
+        </w:numPr>
+      </w:pPr>
+      <w:r>
+        <w:rPr>
+          <w:b/>
+        </w:rPr>
+        <w:t xml:space="preserve">Automatic in CI</w:t>
+      </w:r>
+      <w:r>
+        <w:t xml:space="preserve"> </w:t>
+      </w:r>
+      <w:r>
+        <w:t xml:space="preserve">— the</w:t>
+      </w:r>
+      <w:r>
+        <w:t xml:space="preserve"> </w:t>
+      </w:r>
+      <w:r>
+        <w:rPr>
+          <w:rStyle w:val="VerbatimChar"/>
+        </w:rPr>
+        <w:t xml:space="preserve">smoke-test</w:t>
+      </w:r>
+      <w:r>
+        <w:t xml:space="preserve"> </w:t>
+      </w:r>
+      <w:r>
+        <w:t xml:space="preserve">job in</w:t>
+      </w:r>
+      <w:r>
+        <w:t xml:space="preserve"> </w:t>
+      </w:r>
+      <w:r>
+        <w:rPr>
+          <w:rStyle w:val="VerbatimChar"/>
+        </w:rPr>
+        <w:t xml:space="preserve">redeploy.yml</w:t>
+      </w:r>
+      <w:r>
+        <w:t xml:space="preserve"> </w:t>
+      </w:r>
+      <w:r>
+        <w:t xml:space="preserve">runs Newman from a GitHub</w:t>
+      </w:r>
+      <w:r>
+        <w:t xml:space="preserve"> </w:t>
+      </w:r>
+      <w:r>
+        <w:t xml:space="preserve">runner against</w:t>
+      </w:r>
+      <w:r>
+        <w:t xml:space="preserve"> </w:t>
+      </w:r>
+      <w:r>
+        <w:rPr>
+          <w:rStyle w:val="VerbatimChar"/>
+        </w:rPr>
+        <w:t xml:space="preserve">http://${EC2_APP_HOST}</w:t>
+      </w:r>
+      <w:r>
+        <w:t xml:space="preserve"> </w:t>
+      </w:r>
+      <w:r>
+        <w:t xml:space="preserve">after every deploy and uploads</w:t>
+      </w:r>
+      <w:r>
+        <w:t xml:space="preserve"> </w:t>
+      </w:r>
+      <w:r>
+        <w:rPr>
+          <w:rStyle w:val="VerbatimChar"/>
+        </w:rPr>
+        <w:t xml:space="preserve">newman-report</w:t>
+      </w:r>
+      <w:r>
+        <w:t xml:space="preserve">.</w:t>
+      </w:r>
+    </w:p>
+    <w:p>
+      <w:pPr>
+        <w:numPr>
+          <w:ilvl w:val="0"/>
+          <w:numId w:val="1016"/>
+        </w:numPr>
+      </w:pPr>
+      <w:r>
+        <w:rPr>
+          <w:b/>
+        </w:rPr>
+        <w:t xml:space="preserve">Manual on the app host:</w:t>
+      </w:r>
+    </w:p>
+    <w:p>
+      <w:pPr>
+        <w:numPr>
+          <w:ilvl w:val="0"/>
+          <w:numId w:val="1000"/>
+        </w:numPr>
+        <w:pStyle w:val="SourceCode"/>
+      </w:pPr>
+      <w:r>
+        <w:rPr>
+          <w:rStyle w:val="BuiltInTok"/>
+        </w:rPr>
+        <w:t xml:space="preserve">cd</w:t>
+      </w:r>
+      <w:r>
+        <w:rPr>
+          <w:rStyle w:val="NormalTok"/>
+        </w:rPr>
+        <w:t xml:space="preserve"> ~/app </w:t>
+      </w:r>
+      <w:r>
+        <w:rPr>
+          <w:rStyle w:val="KeywordTok"/>
+        </w:rPr>
+        <w:t xml:space="preserve">&amp;&amp;</w:t>
+      </w:r>
+      <w:r>
+        <w:rPr>
+          <w:rStyle w:val="NormalTok"/>
+        </w:rPr>
+        <w:t xml:space="preserve"> </w:t>
+      </w:r>
+      <w:r>
+        <w:rPr>
+          <w:rStyle w:val="FunctionTok"/>
+        </w:rPr>
+        <w:t xml:space="preserve">bash</w:t>
+      </w:r>
+      <w:r>
+        <w:rPr>
+          <w:rStyle w:val="NormalTok"/>
+        </w:rPr>
+        <w:t xml:space="preserve"> scripts/run_api_tests.sh           # tests http://localhost:5000</w:t>
+      </w:r>
+      <w:r>
+        <w:br/>
+      </w:r>
+      <w:r>
+        <w:rPr>
+          <w:rStyle w:val="CommentTok"/>
+        </w:rPr>
+        <w:t xml:space="preserve"># copy the report to your PC:</w:t>
+      </w:r>
+      <w:r>
+        <w:br/>
+      </w:r>
+      <w:r>
+        <w:rPr>
+          <w:rStyle w:val="FunctionTok"/>
+        </w:rPr>
+        <w:t xml:space="preserve">scp</w:t>
+      </w:r>
+      <w:r>
+        <w:rPr>
+          <w:rStyle w:val="NormalTok"/>
+        </w:rPr>
+        <w:t xml:space="preserve"> -i </w:t>
+      </w:r>
+      <w:r>
+        <w:rPr>
+          <w:rStyle w:val="VariableTok"/>
+        </w:rPr>
+        <w:t xml:space="preserve">$key</w:t>
+      </w:r>
+      <w:r>
+        <w:rPr>
+          <w:rStyle w:val="NormalTok"/>
+        </w:rPr>
+        <w:t xml:space="preserve"> ec2-user@</w:t>
+      </w:r>
+      <w:r>
+        <w:rPr>
+          <w:rStyle w:val="OperatorTok"/>
+        </w:rPr>
+        <w:t xml:space="preserve">&lt;</w:t>
+      </w:r>
+      <w:r>
+        <w:rPr>
+          <w:rStyle w:val="NormalTok"/>
+        </w:rPr>
+        <w:t xml:space="preserve">app-ip</w:t>
+      </w:r>
+      <w:r>
+        <w:rPr>
+          <w:rStyle w:val="OperatorTok"/>
+        </w:rPr>
+        <w:t xml:space="preserve">&gt;</w:t>
+      </w:r>
+      <w:r>
+        <w:rPr>
+          <w:rStyle w:val="NormalTok"/>
+        </w:rPr>
+        <w:t xml:space="preserve">:~/app/newman-report.html .</w:t>
+      </w:r>
+    </w:p>
+    <w:p>
+      <w:pPr>
+        <w:pStyle w:val="FirstParagraph"/>
+      </w:pPr>
+      <w:r>
+        <w:t xml:space="preserve">For a guaranteed green run, reseed first so the DB is clean:</w:t>
+      </w:r>
+    </w:p>
+    <w:p>
+      <w:pPr>
+        <w:pStyle w:val="SourceCode"/>
+      </w:pPr>
+      <w:r>
+        <w:rPr>
+          <w:rStyle w:val="BuiltInTok"/>
+        </w:rPr>
+        <w:t xml:space="preserve">cd</w:t>
+      </w:r>
+      <w:r>
+        <w:rPr>
+          <w:rStyle w:val="NormalTok"/>
+        </w:rPr>
+        <w:t xml:space="preserve"> ~/app </w:t>
+      </w:r>
+      <w:r>
+        <w:rPr>
+          <w:rStyle w:val="KeywordTok"/>
+        </w:rPr>
+        <w:t xml:space="preserve">&amp;&amp;</w:t>
+      </w:r>
+      <w:r>
+        <w:rPr>
+          <w:rStyle w:val="NormalTok"/>
+        </w:rPr>
+        <w:t xml:space="preserve"> </w:t>
+      </w:r>
+      <w:r>
+        <w:rPr>
+          <w:rStyle w:val="FunctionTok"/>
+        </w:rPr>
+        <w:t xml:space="preserve">git</w:t>
+      </w:r>
+      <w:r>
+        <w:rPr>
+          <w:rStyle w:val="NormalTok"/>
+        </w:rPr>
+        <w:t xml:space="preserve"> pull origin main</w:t>
+      </w:r>
+      <w:r>
+        <w:br/>
+      </w:r>
+      <w:r>
+        <w:rPr>
+          <w:rStyle w:val="BuiltInTok"/>
+        </w:rPr>
+        <w:t xml:space="preserve">cd</w:t>
+      </w:r>
+      <w:r>
+        <w:rPr>
+          <w:rStyle w:val="NormalTok"/>
+        </w:rPr>
+        <w:t xml:space="preserve"> backend </w:t>
+      </w:r>
+      <w:r>
+        <w:rPr>
+          <w:rStyle w:val="KeywordTok"/>
+        </w:rPr>
+        <w:t xml:space="preserve">&amp;&amp;</w:t>
+      </w:r>
+      <w:r>
+        <w:rPr>
+          <w:rStyle w:val="NormalTok"/>
+        </w:rPr>
+        <w:t xml:space="preserve"> </w:t>
+      </w:r>
+      <w:r>
+        <w:rPr>
+          <w:rStyle w:val="ExtensionTok"/>
+        </w:rPr>
+        <w:t xml:space="preserve">npm</w:t>
+      </w:r>
+      <w:r>
+        <w:rPr>
+          <w:rStyle w:val="NormalTok"/>
+        </w:rPr>
+        <w:t xml:space="preserve"> run seed </w:t>
+      </w:r>
+      <w:r>
+        <w:rPr>
+          <w:rStyle w:val="KeywordTok"/>
+        </w:rPr>
+        <w:t xml:space="preserve">&amp;&amp;</w:t>
+      </w:r>
+      <w:r>
+        <w:rPr>
+          <w:rStyle w:val="NormalTok"/>
+        </w:rPr>
+        <w:t xml:space="preserve"> </w:t>
+      </w:r>
+      <w:r>
+        <w:rPr>
+          <w:rStyle w:val="BuiltInTok"/>
+        </w:rPr>
+        <w:t xml:space="preserve">cd</w:t>
+      </w:r>
+      <w:r>
+        <w:rPr>
+          <w:rStyle w:val="NormalTok"/>
+        </w:rPr>
+        <w:t xml:space="preserve"> ..</w:t>
+      </w:r>
+      <w:r>
+        <w:br/>
+      </w:r>
+      <w:r>
+        <w:rPr>
+          <w:rStyle w:val="FunctionTok"/>
+        </w:rPr>
+        <w:t xml:space="preserve">bash</w:t>
+      </w:r>
+      <w:r>
+        <w:rPr>
+          <w:rStyle w:val="NormalTok"/>
+        </w:rPr>
+        <w:t xml:space="preserve"> scripts/run_api_tests.sh</w:t>
+      </w:r>
+    </w:p>
+    <w:p>
+      <w:pPr>
+        <w:pStyle w:val="Heading3"/>
+      </w:pPr>
+      <w:bookmarkStart w:id="55" w:name="X2cb15984ab8a10aac959343c73f76d48515d98d"/>
+      <w:r>
+        <w:t xml:space="preserve">Collection design rules we had to fix (so the run is green)</w:t>
+      </w:r>
+      <w:bookmarkEnd w:id="55"/>
+    </w:p>
+    <w:p>
+      <w:pPr>
+        <w:numPr>
+          <w:ilvl w:val="0"/>
+          <w:numId w:val="1017"/>
+        </w:numPr>
+        <w:pStyle w:val="Compact"/>
+      </w:pPr>
+      <w:r>
+        <w:rPr>
+          <w:b/>
+        </w:rPr>
+        <w:t xml:space="preserve">Order:</w:t>
+      </w:r>
+      <w:r>
+        <w:t xml:space="preserve"> </w:t>
+      </w:r>
+      <w:r>
+        <w:t xml:space="preserve">Categories + Venues are created</w:t>
+      </w:r>
+      <w:r>
+        <w:t xml:space="preserve"> </w:t>
+      </w:r>
+      <w:r>
+        <w:rPr>
+          <w:b/>
+        </w:rPr>
+        <w:t xml:space="preserve">before</w:t>
+      </w:r>
+      <w:r>
+        <w:t xml:space="preserve"> </w:t>
+      </w:r>
+      <w:r>
+        <w:t xml:space="preserve">Events (Create event needs</w:t>
+      </w:r>
+      <w:r>
+        <w:t xml:space="preserve"> </w:t>
+      </w:r>
+      <w:r>
+        <w:rPr>
+          <w:rStyle w:val="VerbatimChar"/>
+        </w:rPr>
+        <w:t xml:space="preserve">categoryId</w:t>
+      </w:r>
+      <w:r>
+        <w:t xml:space="preserve">/</w:t>
+      </w:r>
+      <w:r>
+        <w:rPr>
+          <w:rStyle w:val="VerbatimChar"/>
+        </w:rPr>
+        <w:t xml:space="preserve">venueId</w:t>
+      </w:r>
+      <w:r>
+        <w:t xml:space="preserve">), and</w:t>
+      </w:r>
+      <w:r>
+        <w:t xml:space="preserve"> </w:t>
+      </w:r>
+      <w:r>
+        <w:rPr>
+          <w:b/>
+        </w:rPr>
+        <w:t xml:space="preserve">Bookings run before any deletes</w:t>
+      </w:r>
+      <w:r>
+        <w:t xml:space="preserve"> </w:t>
+      </w:r>
+      <w:r>
+        <w:t xml:space="preserve">(booking a</w:t>
+      </w:r>
+      <w:r>
+        <w:t xml:space="preserve"> </w:t>
+      </w:r>
+      <w:r>
+        <w:rPr>
+          <w:i/>
+        </w:rPr>
+        <w:t xml:space="preserve">cancelled</w:t>
+      </w:r>
+      <w:r>
+        <w:t xml:space="preserve"> </w:t>
+      </w:r>
+      <w:r>
+        <w:t xml:space="preserve">event returns 400).</w:t>
+      </w:r>
+    </w:p>
+    <w:p>
+      <w:pPr>
+        <w:numPr>
+          <w:ilvl w:val="0"/>
+          <w:numId w:val="1017"/>
+        </w:numPr>
+        <w:pStyle w:val="Compact"/>
+      </w:pPr>
+      <w:r>
+        <w:rPr>
+          <w:b/>
+        </w:rPr>
+        <w:t xml:space="preserve">Cleanup phase last:</w:t>
+      </w:r>
+      <w:r>
+        <w:t xml:space="preserve"> </w:t>
+      </w:r>
+      <w:r>
+        <w:t xml:space="preserve">destructive deletes run at the end in order</w:t>
+      </w:r>
+      <w:r>
+        <w:t xml:space="preserve"> </w:t>
+      </w:r>
+      <w:r>
+        <w:rPr>
+          <w:b/>
+        </w:rPr>
+        <w:t xml:space="preserve">event → clone event → venue → category</w:t>
+      </w:r>
+      <w:r>
+        <w:t xml:space="preserve"> </w:t>
+      </w:r>
+      <w:r>
+        <w:t xml:space="preserve">(the Prototype clone is a draft event that</w:t>
+      </w:r>
+      <w:r>
+        <w:t xml:space="preserve"> </w:t>
+      </w:r>
+      <w:r>
+        <w:t xml:space="preserve">also uses the venue, so it must be deleted before the venue, or venue-delete returns 400).</w:t>
+      </w:r>
+    </w:p>
+    <w:p>
+      <w:pPr>
+        <w:numPr>
+          <w:ilvl w:val="0"/>
+          <w:numId w:val="1017"/>
+        </w:numPr>
+        <w:pStyle w:val="Compact"/>
+      </w:pPr>
+      <w:r>
+        <w:rPr>
+          <w:b/>
+        </w:rPr>
+        <w:t xml:space="preserve">Idempotent register:</w:t>
+      </w:r>
+      <w:r>
+        <w:t xml:space="preserve"> </w:t>
+      </w:r>
+      <w:r>
+        <w:t xml:space="preserve">the Register request uses</w:t>
+      </w:r>
+      <w:r>
+        <w:t xml:space="preserve"> </w:t>
+      </w:r>
+      <w:r>
+        <w:rPr>
+          <w:rStyle w:val="VerbatimChar"/>
+        </w:rPr>
+        <w:t xml:space="preserve">jane.tester+{{$timestamp}}@example.com</w:t>
+      </w:r>
+      <w:r>
+        <w:t xml:space="preserve"> </w:t>
+      </w:r>
+      <w:r>
+        <w:t xml:space="preserve">so re-runs don’t hit</w:t>
+      </w:r>
+      <w:r>
+        <w:t xml:space="preserve"> </w:t>
+      </w:r>
+      <w:r>
+        <w:t xml:space="preserve">“</w:t>
+      </w:r>
+      <w:r>
+        <w:t xml:space="preserve">email already in use</w:t>
+      </w:r>
+      <w:r>
+        <w:t xml:space="preserve">”</w:t>
+      </w:r>
+      <w:r>
+        <w:t xml:space="preserve">.</w:t>
+      </w:r>
+    </w:p>
+    <w:p>
+      <w:pPr>
+        <w:numPr>
+          <w:ilvl w:val="0"/>
+          <w:numId w:val="1017"/>
+        </w:numPr>
+        <w:pStyle w:val="Compact"/>
+      </w:pPr>
+      <w:r>
+        <w:rPr>
+          <w:b/>
+        </w:rPr>
+        <w:t xml:space="preserve">Capture ids:</w:t>
+      </w:r>
+      <w:r>
+        <w:t xml:space="preserve"> </w:t>
+      </w:r>
+      <w:r>
+        <w:rPr>
+          <w:rStyle w:val="VerbatimChar"/>
+        </w:rPr>
+        <w:t xml:space="preserve">List users</w:t>
+      </w:r>
+      <w:r>
+        <w:t xml:space="preserve"> </w:t>
+      </w:r>
+      <w:r>
+        <w:t xml:space="preserve">saves</w:t>
+      </w:r>
+      <w:r>
+        <w:t xml:space="preserve"> </w:t>
+      </w:r>
+      <w:r>
+        <w:rPr>
+          <w:rStyle w:val="VerbatimChar"/>
+        </w:rPr>
+        <w:t xml:space="preserve">userId</w:t>
+      </w:r>
+      <w:r>
+        <w:t xml:space="preserve">;</w:t>
+      </w:r>
+      <w:r>
+        <w:t xml:space="preserve"> </w:t>
+      </w:r>
+      <w:r>
+        <w:rPr>
+          <w:rStyle w:val="VerbatimChar"/>
+        </w:rPr>
+        <w:t xml:space="preserve">Clone event</w:t>
+      </w:r>
+      <w:r>
+        <w:t xml:space="preserve"> </w:t>
+      </w:r>
+      <w:r>
+        <w:t xml:space="preserve">saves</w:t>
+      </w:r>
+      <w:r>
+        <w:t xml:space="preserve"> </w:t>
+      </w:r>
+      <w:r>
+        <w:rPr>
+          <w:rStyle w:val="VerbatimChar"/>
+        </w:rPr>
+        <w:t xml:space="preserve">clonedEventId</w:t>
+      </w:r>
+      <w:r>
+        <w:t xml:space="preserve">.</w:t>
+      </w:r>
+    </w:p>
+    <w:p>
+      <w:pPr>
+        <w:pStyle w:val="Heading2"/>
+      </w:pPr>
+      <w:bookmarkStart w:id="56" w:name="Xed2633221c0e3359d10a38e78e256962c60b3f1"/>
+      <w:r>
+        <w:t xml:space="preserve">17. From-scratch deploy (demolish → rebuild) + every gotcha we hit</w:t>
+      </w:r>
+      <w:bookmarkEnd w:id="56"/>
+    </w:p>
+    <w:p>
+      <w:pPr>
+        <w:pStyle w:val="Heading3"/>
+      </w:pPr>
+      <w:bookmarkStart w:id="57" w:name="tear-down-dont-rely-on-terraform-destroy"/>
+      <w:r>
+        <w:t xml:space="preserve">Tear down — DON’T rely on</w:t>
+      </w:r>
+      <w:r>
+        <w:t xml:space="preserve"> </w:t>
+      </w:r>
+      <w:r>
+        <w:rPr>
+          <w:rStyle w:val="VerbatimChar"/>
+        </w:rPr>
+        <w:t xml:space="preserve">terraform destroy</w:t>
+      </w:r>
+      <w:bookmarkEnd w:id="57"/>
+    </w:p>
+    <w:p>
+      <w:pPr>
+        <w:pStyle w:val="FirstParagraph"/>
+      </w:pPr>
+      <w:r>
+        <w:t xml:space="preserve">There is</w:t>
+      </w:r>
+      <w:r>
+        <w:t xml:space="preserve"> </w:t>
+      </w:r>
+      <w:r>
+        <w:rPr>
+          <w:b/>
+        </w:rPr>
+        <w:t xml:space="preserve">no S3 backend</w:t>
+      </w:r>
+      <w:r>
+        <w:t xml:space="preserve">, so Terraform state lived only on the Actions runner and is gone</w:t>
+      </w:r>
+      <w:r>
+        <w:t xml:space="preserve"> </w:t>
+      </w:r>
+      <w:r>
+        <w:t xml:space="preserve">after apply. A</w:t>
+      </w:r>
+      <w:r>
+        <w:t xml:space="preserve"> </w:t>
+      </w:r>
+      <w:r>
+        <w:rPr>
+          <w:rStyle w:val="VerbatimChar"/>
+        </w:rPr>
+        <w:t xml:space="preserve">destroy</w:t>
+      </w:r>
+      <w:r>
+        <w:t xml:space="preserve"> </w:t>
+      </w:r>
+      <w:r>
+        <w:t xml:space="preserve">run starts with empty state and won’t find your resources. Instead:</w:t>
+      </w:r>
+      <w:r>
+        <w:t xml:space="preserve"> </w:t>
+      </w:r>
+      <w:r>
+        <w:t xml:space="preserve">-</w:t>
+      </w:r>
+      <w:r>
+        <w:t xml:space="preserve"> </w:t>
+      </w:r>
+      <w:r>
+        <w:rPr>
+          <w:b/>
+        </w:rPr>
+        <w:t xml:space="preserve">AWS Console:</w:t>
+      </w:r>
+      <w:r>
+        <w:t xml:space="preserve"> </w:t>
+      </w:r>
+      <w:r>
+        <w:t xml:space="preserve">terminate both EC2s, then delete their security groups, or</w:t>
+      </w:r>
+      <w:r>
+        <w:t xml:space="preserve"> </w:t>
+      </w:r>
+      <w:r>
+        <w:t xml:space="preserve">-</w:t>
+      </w:r>
+      <w:r>
+        <w:t xml:space="preserve"> </w:t>
+      </w:r>
+      <w:r>
+        <w:rPr>
+          <w:b/>
+        </w:rPr>
+        <w:t xml:space="preserve">Script:</w:t>
+      </w:r>
+      <w:r>
+        <w:t xml:space="preserve"> </w:t>
+      </w:r>
+      <w:r>
+        <w:rPr>
+          <w:rStyle w:val="VerbatimChar"/>
+        </w:rPr>
+        <w:t xml:space="preserve">python scripts/aws_teardown.py --region us-east-1 --execute</w:t>
+      </w:r>
+      <w:r>
+        <w:t xml:space="preserve"> </w:t>
+      </w:r>
+      <w:r>
+        <w:t xml:space="preserve">(dry-run first without</w:t>
+      </w:r>
+      <w:r>
+        <w:t xml:space="preserve"> </w:t>
+      </w:r>
+      <w:r>
+        <w:rPr>
+          <w:rStyle w:val="VerbatimChar"/>
+        </w:rPr>
+        <w:t xml:space="preserve">--execute</w:t>
+      </w:r>
+      <w:r>
+        <w:t xml:space="preserve">; scoped to the</w:t>
+      </w:r>
+      <w:r>
+        <w:t xml:space="preserve"> </w:t>
+      </w:r>
+      <w:r>
+        <w:rPr>
+          <w:rStyle w:val="VerbatimChar"/>
+        </w:rPr>
+        <w:t xml:space="preserve">Project=event-ticketing</w:t>
+      </w:r>
+      <w:r>
+        <w:t xml:space="preserve"> </w:t>
+      </w:r>
+      <w:r>
+        <w:t xml:space="preserve">tag).</w:t>
+      </w:r>
+    </w:p>
+    <w:p>
+      <w:pPr>
+        <w:pStyle w:val="Heading3"/>
+      </w:pPr>
+      <w:bookmarkStart w:id="58" w:name="rebuild-clean-sequence"/>
+      <w:r>
+        <w:t xml:space="preserve">Rebuild — clean sequence</w:t>
+      </w:r>
+      <w:bookmarkEnd w:id="58"/>
+    </w:p>
+    <w:p>
+      <w:pPr>
+        <w:numPr>
+          <w:ilvl w:val="0"/>
+          <w:numId w:val="1018"/>
+        </w:numPr>
+        <w:pStyle w:val="Compact"/>
+      </w:pPr>
+      <w:r>
+        <w:rPr>
+          <w:b/>
+        </w:rPr>
+        <w:t xml:space="preserve">Apply:</w:t>
+      </w:r>
+      <w:r>
+        <w:t xml:space="preserve"> </w:t>
+      </w:r>
+      <w:r>
+        <w:t xml:space="preserve">Actions →</w:t>
+      </w:r>
+      <w:r>
+        <w:t xml:space="preserve"> </w:t>
+      </w:r>
+      <w:r>
+        <w:rPr>
+          <w:i/>
+        </w:rPr>
+        <w:t xml:space="preserve">AWS Infrastructure CI/CD</w:t>
+      </w:r>
+      <w:r>
+        <w:t xml:space="preserve"> </w:t>
+      </w:r>
+      <w:r>
+        <w:t xml:space="preserve">→ Run workflow →</w:t>
+      </w:r>
+      <w:r>
+        <w:t xml:space="preserve"> </w:t>
+      </w:r>
+      <w:r>
+        <w:rPr>
+          <w:b/>
+        </w:rPr>
+        <w:t xml:space="preserve">Branch =</w:t>
+      </w:r>
+      <w:r>
+        <w:rPr>
+          <w:b/>
+        </w:rPr>
+        <w:t xml:space="preserve"> </w:t>
+      </w:r>
+      <w:r>
+        <w:rPr>
+          <w:rStyle w:val="VerbatimChar"/>
+          <w:b/>
+        </w:rPr>
+        <w:t xml:space="preserve">production</w:t>
+      </w:r>
+      <w:r>
+        <w:t xml:space="preserve"> </w:t>
+      </w:r>
+      <w:r>
+        <w:t xml:space="preserve">→</w:t>
+      </w:r>
+      <w:r>
+        <w:t xml:space="preserve"> </w:t>
+      </w:r>
+      <w:r>
+        <w:rPr>
+          <w:rStyle w:val="VerbatimChar"/>
+        </w:rPr>
+        <w:t xml:space="preserve">action = apply</w:t>
+      </w:r>
+      <w:r>
+        <w:t xml:space="preserve">. (~5 min. App auto-clones event-ticket_3, seeds, starts API, installs</w:t>
+      </w:r>
+      <w:r>
+        <w:t xml:space="preserve"> </w:t>
+      </w:r>
+      <w:r>
+        <w:t xml:space="preserve">Newman + runs an initial test.)</w:t>
+      </w:r>
+    </w:p>
+    <w:p>
+      <w:pPr>
+        <w:numPr>
+          <w:ilvl w:val="0"/>
+          <w:numId w:val="1018"/>
+        </w:numPr>
+        <w:pStyle w:val="Compact"/>
+      </w:pPr>
+      <w:r>
+        <w:rPr>
+          <w:b/>
+        </w:rPr>
+        <w:t xml:space="preserve">Get the new App public IP</w:t>
+      </w:r>
+      <w:r>
+        <w:t xml:space="preserve"> </w:t>
+      </w:r>
+      <w:r>
+        <w:t xml:space="preserve">from the run summary (it changes every apply).</w:t>
+      </w:r>
+    </w:p>
+    <w:p>
+      <w:pPr>
+        <w:numPr>
+          <w:ilvl w:val="0"/>
+          <w:numId w:val="1018"/>
+        </w:numPr>
+        <w:pStyle w:val="Compact"/>
+      </w:pPr>
+      <w:r>
+        <w:rPr>
+          <w:b/>
+        </w:rPr>
+        <w:t xml:space="preserve">Update the</w:t>
+      </w:r>
+      <w:r>
+        <w:rPr>
+          <w:b/>
+        </w:rPr>
+        <w:t xml:space="preserve"> </w:t>
+      </w:r>
+      <w:r>
+        <w:rPr>
+          <w:rStyle w:val="VerbatimChar"/>
+          <w:b/>
+        </w:rPr>
+        <w:t xml:space="preserve">EC2_APP_HOST</w:t>
+      </w:r>
+      <w:r>
+        <w:t xml:space="preserve"> </w:t>
+      </w:r>
+      <w:r>
+        <w:t xml:space="preserve">secret to that IP.</w:t>
+      </w:r>
+    </w:p>
+    <w:p>
+      <w:pPr>
+        <w:numPr>
+          <w:ilvl w:val="0"/>
+          <w:numId w:val="1018"/>
+        </w:numPr>
+        <w:pStyle w:val="Compact"/>
+      </w:pPr>
+      <w:r>
+        <w:rPr>
+          <w:b/>
+        </w:rPr>
+        <w:t xml:space="preserve">SSH in</w:t>
+      </w:r>
+      <w:r>
+        <w:t xml:space="preserve"> </w:t>
+      </w:r>
+      <w:r>
+        <w:t xml:space="preserve">and run the real test (see §16). New key each run only if you recreated the</w:t>
+      </w:r>
+      <w:r>
+        <w:t xml:space="preserve"> </w:t>
+      </w:r>
+      <w:r>
+        <w:t xml:space="preserve">key pair.</w:t>
+      </w:r>
+    </w:p>
+    <w:p>
+      <w:pPr>
+        <w:numPr>
+          <w:ilvl w:val="0"/>
+          <w:numId w:val="1018"/>
+        </w:numPr>
+        <w:pStyle w:val="Compact"/>
+      </w:pPr>
+      <w:r>
+        <w:rPr>
+          <w:b/>
+        </w:rPr>
+        <w:t xml:space="preserve">Trigger CI deploy + smoke-test:</w:t>
+      </w:r>
+      <w:r>
+        <w:t xml:space="preserve"> </w:t>
+      </w:r>
+      <w:r>
+        <w:t xml:space="preserve">push</w:t>
+      </w:r>
+      <w:r>
+        <w:t xml:space="preserve"> </w:t>
+      </w:r>
+      <w:r>
+        <w:rPr>
+          <w:rStyle w:val="VerbatimChar"/>
+        </w:rPr>
+        <w:t xml:space="preserve">main → production</w:t>
+      </w:r>
+      <w:r>
+        <w:t xml:space="preserve">.</w:t>
+      </w:r>
+    </w:p>
+    <w:p>
+      <w:pPr>
+        <w:pStyle w:val="Heading3"/>
+      </w:pPr>
+      <w:bookmarkStart w:id="59" w:name="gotchas-cause-fix-keep-this-list-handy"/>
+      <w:r>
+        <w:t xml:space="preserve">Gotchas (cause → fix) — keep this list handy</w:t>
+      </w:r>
+      <w:bookmarkEnd w:id="59"/>
+    </w:p>
+    <w:tbl>
+      <w:tblPr>
+        <w:tblStyle w:val="Table"/>
+        <w:tblW w:type="pct" w:w="5000.0"/>
+        <w:tblLook w:firstRow="1"/>
+      </w:tblPr>
+      <w:tblGrid>
+        <w:gridCol w:w="2640"/>
+        <w:gridCol w:w="2640"/>
+        <w:gridCol w:w="2640"/>
+      </w:tblGrid>
+      <w:tr>
+        <w:trPr>
+          <w:cnfStyle w:firstRow="1"/>
+        </w:trPr>
+        <w:tc>
+          <w:tcPr>
+            <w:tcBorders>
+              <w:bottom w:val="single"/>
+            </w:tcBorders>
+            <w:vAlign w:val="bottom"/>
+          </w:tcPr>
+          <w:p>
+            <w:pPr>
+              <w:pStyle w:val="Compact"/>
+              <w:jc w:val="left"/>
+            </w:pPr>
+            <w:r>
+              <w:t xml:space="preserve">Symptom</w:t>
+            </w:r>
+          </w:p>
+        </w:tc>
+        <w:tc>
+          <w:tcPr>
+            <w:tcBorders>
+              <w:bottom w:val="single"/>
+            </w:tcBorders>
+            <w:vAlign w:val="bottom"/>
+          </w:tcPr>
+          <w:p>
+            <w:pPr>
+              <w:pStyle w:val="Compact"/>
+              <w:jc w:val="left"/>
+            </w:pPr>
+            <w:r>
+              <w:t xml:space="preserve">Cause</w:t>
+            </w:r>
+          </w:p>
+        </w:tc>
+        <w:tc>
+          <w:tcPr>
+            <w:tcBorders>
+              <w:bottom w:val="single"/>
+            </w:tcBorders>
+            <w:vAlign w:val="bottom"/>
+          </w:tcPr>
+          <w:p>
+            <w:pPr>
+              <w:pStyle w:val="Compact"/>
+              <w:jc w:val="left"/>
+            </w:pPr>
+            <w:r>
+              <w:t xml:space="preserve">Fix</w:t>
+            </w:r>
+          </w:p>
+        </w:tc>
+      </w:tr>
+      <w:tr>
+        <w:tc>
+          <w:p>
+            <w:pPr>
+              <w:pStyle w:val="Compact"/>
+              <w:jc w:val="left"/>
+            </w:pPr>
+            <w:r>
+              <w:rPr>
+                <w:rStyle w:val="VerbatimChar"/>
+              </w:rPr>
+              <w:t xml:space="preserve">Could not load credentials from any providers</w:t>
+            </w:r>
+            <w:r>
+              <w:t xml:space="preserve"> </w:t>
+            </w:r>
+            <w:r>
+              <w:t xml:space="preserve">(Terraform Plan, 4s)</w:t>
+            </w:r>
+          </w:p>
+        </w:tc>
+        <w:tc>
+          <w:p>
+            <w:pPr>
+              <w:pStyle w:val="Compact"/>
+              <w:jc w:val="left"/>
+            </w:pPr>
+            <w:r>
+              <w:t xml:space="preserve">AWS secrets not set</w:t>
+            </w:r>
+            <w:r>
+              <w:t xml:space="preserve"> </w:t>
+            </w:r>
+            <w:r>
+              <w:rPr>
+                <w:b/>
+              </w:rPr>
+              <w:t xml:space="preserve">on this repo</w:t>
+            </w:r>
+            <w:r>
+              <w:t xml:space="preserve"> </w:t>
+            </w:r>
+            <w:r>
+              <w:t xml:space="preserve">(secrets are per-repo, don’t copy across)</w:t>
+            </w:r>
+          </w:p>
+        </w:tc>
+        <w:tc>
+          <w:p>
+            <w:pPr>
+              <w:pStyle w:val="Compact"/>
+              <w:jc w:val="left"/>
+            </w:pPr>
+            <w:r>
+              <w:t xml:space="preserve">Add</w:t>
+            </w:r>
+            <w:r>
+              <w:t xml:space="preserve"> </w:t>
+            </w:r>
+            <w:r>
+              <w:rPr>
+                <w:rStyle w:val="VerbatimChar"/>
+              </w:rPr>
+              <w:t xml:space="preserve">AWS_ACCESS_KEY_ID/SECRET</w:t>
+            </w:r>
+            <w:r>
+              <w:t xml:space="preserve">,</w:t>
+            </w:r>
+            <w:r>
+              <w:t xml:space="preserve"> </w:t>
+            </w:r>
+            <w:r>
+              <w:rPr>
+                <w:rStyle w:val="VerbatimChar"/>
+              </w:rPr>
+              <w:t xml:space="preserve">AWS_KEY_PAIR_NAME</w:t>
+            </w:r>
+            <w:r>
+              <w:t xml:space="preserve">,</w:t>
+            </w:r>
+            <w:r>
+              <w:t xml:space="preserve"> </w:t>
+            </w:r>
+            <w:r>
+              <w:rPr>
+                <w:rStyle w:val="VerbatimChar"/>
+              </w:rPr>
+              <w:t xml:space="preserve">MONGO_PASSWORD</w:t>
+            </w:r>
+            <w:r>
+              <w:t xml:space="preserve">,</w:t>
+            </w:r>
+            <w:r>
+              <w:t xml:space="preserve"> </w:t>
+            </w:r>
+            <w:r>
+              <w:rPr>
+                <w:rStyle w:val="VerbatimChar"/>
+              </w:rPr>
+              <w:t xml:space="preserve">JWT_SECRET</w:t>
+            </w:r>
+            <w:r>
+              <w:t xml:space="preserve"> </w:t>
+            </w:r>
+            <w:r>
+              <w:t xml:space="preserve">to event-ticket_3</w:t>
+            </w:r>
+          </w:p>
+        </w:tc>
+      </w:tr>
+      <w:tr>
+        <w:tc>
+          <w:p>
+            <w:pPr>
+              <w:pStyle w:val="Compact"/>
+              <w:jc w:val="left"/>
+            </w:pPr>
+            <w:r>
+              <w:rPr>
+                <w:rStyle w:val="VerbatimChar"/>
+              </w:rPr>
+              <w:t xml:space="preserve">Redeploy</w:t>
+            </w:r>
+            <w:r>
+              <w:t xml:space="preserve"> </w:t>
+            </w:r>
+            <w:r>
+              <w:t xml:space="preserve">fails ~13s at SSH</w:t>
+            </w:r>
+          </w:p>
+        </w:tc>
+        <w:tc>
+          <w:p>
+            <w:pPr>
+              <w:pStyle w:val="Compact"/>
+              <w:jc w:val="left"/>
+            </w:pPr>
+            <w:r>
+              <w:t xml:space="preserve">EC2 not provisioned yet, or</w:t>
+            </w:r>
+            <w:r>
+              <w:t xml:space="preserve"> </w:t>
+            </w:r>
+            <w:r>
+              <w:rPr>
+                <w:rStyle w:val="VerbatimChar"/>
+              </w:rPr>
+              <w:t xml:space="preserve">EC2_APP_HOST=placeholder</w:t>
+            </w:r>
+          </w:p>
+        </w:tc>
+        <w:tc>
+          <w:p>
+            <w:pPr>
+              <w:pStyle w:val="Compact"/>
+              <w:jc w:val="left"/>
+            </w:pPr>
+            <w:r>
+              <w:t xml:space="preserve">Run</w:t>
+            </w:r>
+            <w:r>
+              <w:t xml:space="preserve"> </w:t>
+            </w:r>
+            <w:r>
+              <w:rPr>
+                <w:rStyle w:val="VerbatimChar"/>
+              </w:rPr>
+              <w:t xml:space="preserve">apply</w:t>
+            </w:r>
+            <w:r>
+              <w:t xml:space="preserve"> </w:t>
+            </w:r>
+            <w:r>
+              <w:t xml:space="preserve">first; set</w:t>
+            </w:r>
+            <w:r>
+              <w:t xml:space="preserve"> </w:t>
+            </w:r>
+            <w:r>
+              <w:rPr>
+                <w:rStyle w:val="VerbatimChar"/>
+              </w:rPr>
+              <w:t xml:space="preserve">EC2_APP_HOST</w:t>
+            </w:r>
+            <w:r>
+              <w:t xml:space="preserve"> </w:t>
+            </w:r>
+            <w:r>
+              <w:t xml:space="preserve">to the new IP</w:t>
+            </w:r>
+          </w:p>
+        </w:tc>
+      </w:tr>
+      <w:tr>
+        <w:tc>
+          <w:p>
+            <w:pPr>
+              <w:pStyle w:val="Compact"/>
+              <w:jc w:val="left"/>
+            </w:pPr>
+            <w:r>
+              <w:t xml:space="preserve">App EC2 runs the wrong code</w:t>
+            </w:r>
+          </w:p>
+        </w:tc>
+        <w:tc>
+          <w:p>
+            <w:pPr>
+              <w:pStyle w:val="Compact"/>
+              <w:jc w:val="left"/>
+            </w:pPr>
+            <w:r>
+              <w:rPr>
+                <w:rStyle w:val="VerbatimChar"/>
+              </w:rPr>
+              <w:t xml:space="preserve">deploy.yml</w:t>
+            </w:r>
+            <w:r>
+              <w:t xml:space="preserve"> </w:t>
+            </w:r>
+            <w:r>
+              <w:t xml:space="preserve">cloned</w:t>
+            </w:r>
+            <w:r>
+              <w:t xml:space="preserve"> </w:t>
+            </w:r>
+            <w:r>
+              <w:rPr>
+                <w:rStyle w:val="VerbatimChar"/>
+              </w:rPr>
+              <w:t xml:space="preserve">event-ticket</w:t>
+            </w:r>
+            <w:r>
+              <w:t xml:space="preserve"> </w:t>
+            </w:r>
+            <w:r>
+              <w:t xml:space="preserve">(A1)</w:t>
+            </w:r>
+          </w:p>
+        </w:tc>
+        <w:tc>
+          <w:p>
+            <w:pPr>
+              <w:pStyle w:val="Compact"/>
+              <w:jc w:val="left"/>
+            </w:pPr>
+            <w:r>
+              <w:t xml:space="preserve">Fixed: it now clones</w:t>
+            </w:r>
+            <w:r>
+              <w:t xml:space="preserve"> </w:t>
+            </w:r>
+            <w:r>
+              <w:rPr>
+                <w:rStyle w:val="VerbatimChar"/>
+              </w:rPr>
+              <w:t xml:space="preserve">event-ticket_3</w:t>
+            </w:r>
+          </w:p>
+        </w:tc>
+      </w:tr>
+      <w:tr>
+        <w:tc>
+          <w:p>
+            <w:pPr>
+              <w:pStyle w:val="Compact"/>
+              <w:jc w:val="left"/>
+            </w:pPr>
+            <w:r>
+              <w:rPr>
+                <w:rStyle w:val="VerbatimChar"/>
+              </w:rPr>
+              <w:t xml:space="preserve">not a recognised key file format</w:t>
+            </w:r>
+            <w:r>
+              <w:t xml:space="preserve"> </w:t>
+            </w:r>
+            <w:r>
+              <w:t xml:space="preserve">(PuTTY)</w:t>
+            </w:r>
+          </w:p>
+        </w:tc>
+        <w:tc>
+          <w:p>
+            <w:pPr>
+              <w:pStyle w:val="Compact"/>
+              <w:jc w:val="left"/>
+            </w:pPr>
+            <w:r>
+              <w:rPr>
+                <w:rStyle w:val="VerbatimChar"/>
+              </w:rPr>
+              <w:t xml:space="preserve">.pem</w:t>
+            </w:r>
+            <w:r>
+              <w:t xml:space="preserve"> </w:t>
+            </w:r>
+            <w:r>
+              <w:t xml:space="preserve">is OpenSSH, PuTTY needs</w:t>
+            </w:r>
+            <w:r>
+              <w:t xml:space="preserve"> </w:t>
+            </w:r>
+            <w:r>
+              <w:rPr>
+                <w:rStyle w:val="VerbatimChar"/>
+              </w:rPr>
+              <w:t xml:space="preserve">.ppk</w:t>
+            </w:r>
+          </w:p>
+        </w:tc>
+        <w:tc>
+          <w:p>
+            <w:pPr>
+              <w:pStyle w:val="Compact"/>
+              <w:jc w:val="left"/>
+            </w:pPr>
+            <w:r>
+              <w:t xml:space="preserve">PuTTYgen → Load → Save private key (.ppk); or use Windows</w:t>
+            </w:r>
+            <w:r>
+              <w:t xml:space="preserve"> </w:t>
+            </w:r>
+            <w:r>
+              <w:rPr>
+                <w:rStyle w:val="VerbatimChar"/>
+              </w:rPr>
+              <w:t xml:space="preserve">ssh</w:t>
+            </w:r>
+          </w:p>
+        </w:tc>
+      </w:tr>
+      <w:tr>
+        <w:tc>
+          <w:p>
+            <w:pPr>
+              <w:pStyle w:val="Compact"/>
+              <w:jc w:val="left"/>
+            </w:pPr>
+            <w:r>
+              <w:rPr>
+                <w:rStyle w:val="VerbatimChar"/>
+              </w:rPr>
+              <w:t xml:space="preserve">UNPROTECTED PRIVATE KEY FILE</w:t>
+            </w:r>
+            <w:r>
+              <w:t xml:space="preserve"> </w:t>
+            </w:r>
+            <w:r>
+              <w:t xml:space="preserve">/</w:t>
+            </w:r>
+            <w:r>
+              <w:t xml:space="preserve"> </w:t>
+            </w:r>
+            <w:r>
+              <w:rPr>
+                <w:rStyle w:val="VerbatimChar"/>
+              </w:rPr>
+              <w:t xml:space="preserve">bad permissions</w:t>
+            </w:r>
+          </w:p>
+        </w:tc>
+        <w:tc>
+          <w:p>
+            <w:pPr>
+              <w:pStyle w:val="Compact"/>
+              <w:jc w:val="left"/>
+            </w:pPr>
+            <w:r>
+              <w:t xml:space="preserve">Windows ACLs too open on</w:t>
+            </w:r>
+            <w:r>
+              <w:t xml:space="preserve"> </w:t>
+            </w:r>
+            <w:r>
+              <w:rPr>
+                <w:rStyle w:val="VerbatimChar"/>
+              </w:rPr>
+              <w:t xml:space="preserve">.pem</w:t>
+            </w:r>
+          </w:p>
+        </w:tc>
+        <w:tc>
+          <w:p>
+            <w:pPr>
+              <w:pStyle w:val="Compact"/>
+              <w:jc w:val="left"/>
+            </w:pPr>
+            <w:r>
+              <w:rPr>
+                <w:rStyle w:val="VerbatimChar"/>
+              </w:rPr>
+              <w:t xml:space="preserve">icacls $key /inheritance:r /grant:r "$($env:USERNAME):R"</w:t>
+            </w:r>
+          </w:p>
+        </w:tc>
+      </w:tr>
+      <w:tr>
+        <w:tc>
+          <w:p>
+            <w:pPr>
+              <w:pStyle w:val="Compact"/>
+              <w:jc w:val="left"/>
+            </w:pPr>
+            <w:r>
+              <w:rPr>
+                <w:rStyle w:val="VerbatimChar"/>
+              </w:rPr>
+              <w:t xml:space="preserve">Load key … invalid format</w:t>
+            </w:r>
+          </w:p>
+        </w:tc>
+        <w:tc>
+          <w:p>
+            <w:pPr>
+              <w:pStyle w:val="Compact"/>
+              <w:jc w:val="left"/>
+            </w:pPr>
+            <w:r>
+              <w:t xml:space="preserve">key has BOM/UTF-16, or it’s a</w:t>
+            </w:r>
+            <w:r>
+              <w:t xml:space="preserve"> </w:t>
+            </w:r>
+            <w:r>
+              <w:rPr>
+                <w:rStyle w:val="VerbatimChar"/>
+              </w:rPr>
+              <w:t xml:space="preserve">.ppk</w:t>
+            </w:r>
+          </w:p>
+        </w:tc>
+        <w:tc>
+          <w:p>
+            <w:pPr>
+              <w:pStyle w:val="Compact"/>
+              <w:jc w:val="left"/>
+            </w:pPr>
+            <w:r>
+              <w:t xml:space="preserve">re-download</w:t>
+            </w:r>
+            <w:r>
+              <w:t xml:space="preserve"> </w:t>
+            </w:r>
+            <w:r>
+              <w:rPr>
+                <w:rStyle w:val="VerbatimChar"/>
+              </w:rPr>
+              <w:t xml:space="preserve">.pem</w:t>
+            </w:r>
+            <w:r>
+              <w:t xml:space="preserve">, or PuTTYgen → Export OpenSSH key</w:t>
+            </w:r>
+          </w:p>
+        </w:tc>
+      </w:tr>
+      <w:tr>
+        <w:tc>
+          <w:p>
+            <w:pPr>
+              <w:pStyle w:val="Compact"/>
+              <w:jc w:val="left"/>
+            </w:pPr>
+            <w:r>
+              <w:rPr>
+                <w:rStyle w:val="VerbatimChar"/>
+              </w:rPr>
+              <w:t xml:space="preserve">Permission denied (publickey)</w:t>
+            </w:r>
+            <w:r>
+              <w:t xml:space="preserve"> </w:t>
+            </w:r>
+            <w:r>
+              <w:t xml:space="preserve">(perms OK)</w:t>
+            </w:r>
+          </w:p>
+        </w:tc>
+        <w:tc>
+          <w:p>
+            <w:pPr>
+              <w:pStyle w:val="Compact"/>
+              <w:jc w:val="left"/>
+            </w:pPr>
+            <w:r>
+              <w:rPr>
+                <w:rStyle w:val="VerbatimChar"/>
+              </w:rPr>
+              <w:t xml:space="preserve">.pem</w:t>
+            </w:r>
+            <w:r>
+              <w:t xml:space="preserve"> </w:t>
+            </w:r>
+            <w:r>
+              <w:t xml:space="preserve">doesn’t match</w:t>
+            </w:r>
+            <w:r>
+              <w:t xml:space="preserve"> </w:t>
+            </w:r>
+            <w:r>
+              <w:rPr>
+                <w:rStyle w:val="VerbatimChar"/>
+              </w:rPr>
+              <w:t xml:space="preserve">AWS_KEY_PAIR_NAME</w:t>
+            </w:r>
+          </w:p>
+        </w:tc>
+        <w:tc>
+          <w:p>
+            <w:pPr>
+              <w:pStyle w:val="Compact"/>
+              <w:jc w:val="left"/>
+            </w:pPr>
+            <w:r>
+              <w:t xml:space="preserve">use the matching key, or recreate key pair + re-apply</w:t>
+            </w:r>
+          </w:p>
+        </w:tc>
+      </w:tr>
+      <w:tr>
+        <w:tc>
+          <w:p>
+            <w:pPr>
+              <w:pStyle w:val="Compact"/>
+              <w:jc w:val="left"/>
+            </w:pPr>
+            <w:r>
+              <w:rPr>
+                <w:rStyle w:val="VerbatimChar"/>
+              </w:rPr>
+              <w:t xml:space="preserve">EACCES … /usr/lib/node_modules/newman</w:t>
+            </w:r>
+          </w:p>
+        </w:tc>
+        <w:tc>
+          <w:p>
+            <w:pPr>
+              <w:pStyle w:val="Compact"/>
+              <w:jc w:val="left"/>
+            </w:pPr>
+            <w:r>
+              <w:t xml:space="preserve">global npm install needs root on EC2</w:t>
+            </w:r>
+          </w:p>
+        </w:tc>
+        <w:tc>
+          <w:p>
+            <w:pPr>
+              <w:pStyle w:val="Compact"/>
+              <w:jc w:val="left"/>
+            </w:pPr>
+            <w:r>
+              <w:rPr>
+                <w:rStyle w:val="VerbatimChar"/>
+              </w:rPr>
+              <w:t xml:space="preserve">sudo npm install -g newman</w:t>
+            </w:r>
+            <w:r>
+              <w:t xml:space="preserve"> </w:t>
+            </w:r>
+            <w:r>
+              <w:t xml:space="preserve">(the script now falls back to sudo)</w:t>
+            </w:r>
+          </w:p>
+        </w:tc>
+      </w:tr>
+      <w:tr>
+        <w:tc>
+          <w:p>
+            <w:pPr>
+              <w:pStyle w:val="Compact"/>
+              <w:jc w:val="left"/>
+            </w:pPr>
+            <w:r>
+              <w:t xml:space="preserve">Create event</w:t>
+            </w:r>
+            <w:r>
+              <w:t xml:space="preserve"> </w:t>
+            </w:r>
+            <w:r>
+              <w:rPr>
+                <w:rStyle w:val="VerbatimChar"/>
+              </w:rPr>
+              <w:t xml:space="preserve">400</w:t>
+            </w:r>
+            <w:r>
+              <w:t xml:space="preserve">; booking</w:t>
+            </w:r>
+            <w:r>
+              <w:t xml:space="preserve"> </w:t>
+            </w:r>
+            <w:r>
+              <w:rPr>
+                <w:rStyle w:val="VerbatimChar"/>
+              </w:rPr>
+              <w:t xml:space="preserve">404</w:t>
+            </w:r>
+            <w:r>
+              <w:t xml:space="preserve"> </w:t>
+            </w:r>
+            <w:r>
+              <w:t xml:space="preserve">cascade</w:t>
+            </w:r>
+          </w:p>
+        </w:tc>
+        <w:tc>
+          <w:p>
+            <w:pPr>
+              <w:pStyle w:val="Compact"/>
+              <w:jc w:val="left"/>
+            </w:pPr>
+            <w:r>
+              <w:t xml:space="preserve">collection ordering (see §16)</w:t>
+            </w:r>
+          </w:p>
+        </w:tc>
+        <w:tc>
+          <w:p>
+            <w:pPr>
+              <w:pStyle w:val="Compact"/>
+              <w:jc w:val="left"/>
+            </w:pPr>
+            <w:r>
+              <w:t xml:space="preserve">fixed in the collection</w:t>
+            </w:r>
+          </w:p>
+        </w:tc>
+      </w:tr>
+      <w:tr>
+        <w:tc>
+          <w:p>
+            <w:pPr>
+              <w:pStyle w:val="Compact"/>
+              <w:jc w:val="left"/>
+            </w:pPr>
+            <w:r>
+              <w:rPr>
+                <w:rStyle w:val="VerbatimChar"/>
+              </w:rPr>
+              <w:t xml:space="preserve">Delete venue 400</w:t>
+            </w:r>
+            <w:r>
+              <w:t xml:space="preserve"> </w:t>
+            </w:r>
+            <w:r>
+              <w:t xml:space="preserve">“</w:t>
+            </w:r>
+            <w:r>
+              <w:t xml:space="preserve">used by active event</w:t>
+            </w:r>
+            <w:r>
+              <w:t xml:space="preserve">”</w:t>
+            </w:r>
+          </w:p>
+        </w:tc>
+        <w:tc>
+          <w:p>
+            <w:pPr>
+              <w:pStyle w:val="Compact"/>
+              <w:jc w:val="left"/>
+            </w:pPr>
+            <w:r>
+              <w:t xml:space="preserve">leftover draft (the Prototype clone)</w:t>
+            </w:r>
+          </w:p>
+        </w:tc>
+        <w:tc>
+          <w:p>
+            <w:pPr>
+              <w:pStyle w:val="Compact"/>
+              <w:jc w:val="left"/>
+            </w:pPr>
+            <w:r>
+              <w:t xml:space="preserve">Cleanup deletes the clone before the venue</w:t>
+            </w:r>
+          </w:p>
+        </w:tc>
+      </w:tr>
+    </w:tbl>
+    <w:p>
+      <w:r>
+        <w:pict>
+          <v:rect style="width:0;height:1.5pt" o:hralign="center" o:hrstd="t" o:hr="t"/>
+        </w:pict>
+      </w:r>
+    </w:p>
+    <w:p>
+      <w:pPr>
+        <w:pStyle w:val="FirstParagraph"/>
+      </w:pPr>
+      <w:r>
+        <w:rPr>
+          <w:i/>
+        </w:rPr>
         <w:t xml:space="preserve">Personal runbook — keep in the repo root so the whole team follows the same steps.</w:t>
       </w:r>
     </w:p>
@@ -7490,7 +9309,7 @@
         <w:rPr>
           <w:i/>
         </w:rPr>
-        <w:t xml:space="preserve">Last updated: 2026-06-21 — stacked the 3 code branches on event-ticket_2; verified CI</w:t>
+        <w:t xml:space="preserve">Last updated: 2026-06-21 — added §16 real API testing (Newman) and §17 from-scratch deploy</w:t>
       </w:r>
       <w:r>
         <w:rPr>
@@ -7502,7 +9321,7 @@
         <w:rPr>
           <w:i/>
         </w:rPr>
-        <w:t xml:space="preserve">(40 passing, build ok, integrated merge clean); added branch-protection setup (§14).</w:t>
+        <w:t xml:space="preserve">+ full gotchas table (SSH key, perms, per-repo secrets, ephemeral TF state, collection fixes).</w:t>
       </w:r>
     </w:p>
     <w:sectPr/>
@@ -8089,6 +9908,42 @@
   </w:num>
   <w:num w:numId="1015">
     <w:abstractNumId w:val="991"/>
+  </w:num>
+  <w:num w:numId="1016">
+    <w:abstractNumId w:val="991"/>
+  </w:num>
+  <w:num w:numId="1017">
+    <w:abstractNumId w:val="991"/>
+  </w:num>
+  <w:num w:numId="1018">
+    <w:abstractNumId w:val="99411"/>
+    <w:lvlOverride w:ilvl="0">
+      <w:startOverride w:val="1"/>
+    </w:lvlOverride>
+    <w:lvlOverride w:ilvl="1">
+      <w:startOverride w:val="1"/>
+    </w:lvlOverride>
+    <w:lvlOverride w:ilvl="2">
+      <w:startOverride w:val="1"/>
+    </w:lvlOverride>
+    <w:lvlOverride w:ilvl="3">
+      <w:startOverride w:val="1"/>
+    </w:lvlOverride>
+    <w:lvlOverride w:ilvl="4">
+      <w:startOverride w:val="1"/>
+    </w:lvlOverride>
+    <w:lvlOverride w:ilvl="5">
+      <w:startOverride w:val="1"/>
+    </w:lvlOverride>
+    <w:lvlOverride w:ilvl="6">
+      <w:startOverride w:val="1"/>
+    </w:lvlOverride>
+    <w:lvlOverride w:ilvl="7">
+      <w:startOverride w:val="1"/>
+    </w:lvlOverride>
+    <w:lvlOverride w:ilvl="8">
+      <w:startOverride w:val="1"/>
+    </w:lvlOverride>
   </w:num>
 </w:numbering>
 </file>

</xml_diff>